<commit_message>
Hoan thanh lab2: day du ma nguon va TODO
</commit_message>
<xml_diff>
--- a/Huong_dan.docx
+++ b/Huong_dan.docx
@@ -14,7 +14,7 @@
           <w:color w:val="000000"/>
           <w:sz w:val="28"/>
         </w:rPr>
-        <w:t>LAB 01</w:t>
+        <w:t>LAB 02</w:t>
       </w:r>
     </w:p>
     <w:p>
@@ -29,7 +29,7 @@
           <w:color w:val="000000"/>
           <w:sz w:val="28"/>
         </w:rPr>
-        <w:t>VẬN HÀNH DỰ ÁN TRÊN LINUX VÀ VIẾT SHELL SCRIPT</w:t>
+        <w:t>XÂY DỰNG MODULE PHP KIỂM TRA ĐIỀU KIỆN ĐĂNG KÝ</w:t>
       </w:r>
     </w:p>
     <w:p>
@@ -70,7 +70,7 @@
           <w:b w:val="0"/>
           <w:sz w:val="26"/>
         </w:rPr>
-        <w:t>Nội dung bài giảng: Chương 2, slide 10–13: Ubuntu; 14–25: Shell, biến, điều kiện, vòng lặp, chuỗi, mảng, hàm. Số trang tính cả trang bìa. Git và kiểm thử được sử dụng để hỗ trợ thực hành.</w:t>
+        <w:t>Nội dung bài giảng: Chương 3, slide 3–8: PHP, kiểu dữ liệu, biến, toán tử, điều kiện, hàm và đối tượng. Số trang tính cả trang bìa. Git và kiểm thử được sử dụng để hỗ trợ thực hành.</w:t>
       </w:r>
     </w:p>
     <w:p>
@@ -99,7 +99,7 @@
           <w:color w:val="000000"/>
           <w:sz w:val="26"/>
         </w:rPr>
-        <w:t>- Sử dụng lệnh Linux để xác định đúng thư mục và tệp của dự án.</w:t>
+        <w:t>- Giải thích đầu vào, đầu ra và thứ tự kiểm tra của một quy tắc PHP.</w:t>
       </w:r>
     </w:p>
     <w:p>
@@ -115,7 +115,23 @@
           <w:color w:val="000000"/>
           <w:sz w:val="26"/>
         </w:rPr>
-        <w:t>- Viết script có biến, hàm, điều kiện và vòng lặp; đọc đúng mã thoát.</w:t>
+        <w:t>- Viết hàm/lớp độc lập với HTML và CSDL; gọi được từ chương trình thử.</w:t>
+      </w:r>
+    </w:p>
+    <w:p>
+      <w:pPr>
+        <w:widowControl/>
+        <w:ind w:firstLine="0" w:left="0"/>
+        <w:jc w:val="left"/>
+      </w:pPr>
+      <w:r>
+        <w:rPr>
+          <w:rFonts w:ascii="Times New Roman" w:hAnsi="Times New Roman"/>
+          <w:b w:val="0"/>
+          <w:color w:val="000000"/>
+          <w:sz w:val="26"/>
+        </w:rPr>
+        <w:t>- Tự mở rộng quy tắc với ba kết quả và xử lý dữ liệu biên.</w:t>
       </w:r>
     </w:p>
     <w:p>
@@ -130,22 +146,7 @@
           <w:b w:val="0"/>
           <w:sz w:val="26"/>
         </w:rPr>
-        <w:t>- Kiểm tra công cụ và tệp cần thiết; xử lý trường hợp thiếu điều kiện chạy.</w:t>
-      </w:r>
-    </w:p>
-    <w:p>
-      <w:pPr>
-        <w:widowControl/>
-        <w:ind w:firstLine="0" w:left="0"/>
-        <w:jc w:val="left"/>
-      </w:pPr>
-      <w:r>
-        <w:rPr>
-          <w:rFonts w:ascii="Times New Roman" w:hAnsi="Times New Roman"/>
-          <w:b w:val="0"/>
-          <w:sz w:val="26"/>
-        </w:rPr>
-        <w:t>- Viết và kiểm thử script quét nhiều tệp PHP, tổng hợp kết quả và trả đúng mã thoát.</w:t>
+        <w:t>- Hoàn thiện lớp RegistrationPolicy và kiểm thử đầy đủ ba trạng thái đăng ký.</w:t>
       </w:r>
     </w:p>
     <w:p>
@@ -241,7 +242,7 @@
           <w:b w:val="0"/>
           <w:sz w:val="26"/>
         </w:rPr>
-        <w:t>CommunityPass là ứng dụng đăng ký tham dự sự kiện. Khi tiếp nhận mã nguồn, cần kiểm tra công cụ PHP, các tệp của dự án và khả năng khởi chạy ứng dụng. Trong bài này, sinh viên sử dụng lệnh Linux và viết Shell Script để tự động thực hiện các bước kiểm tra đó.</w:t>
+        <w:t>Một sự kiện có sức chứa 10 người. Hệ thống cần xác định có thể tiếp nhận thêm đăng ký hay không dựa trên số người hiện tại. Bài thực hành xây dựng quy tắc này bằng hàm và lớp PHP; chưa sử dụng Form hoặc cơ sở dữ liệu.</w:t>
       </w:r>
     </w:p>
     <w:p>
@@ -254,69 +255,325 @@
           <w:b w:val="0"/>
           <w:sz w:val="26"/>
         </w:rPr>
-        <w:t>Mã PHP đã được cung cấp để phục vụ việc chạy thử. Nội dung thực hành tập trung vào biến, hàm, điều kiện, vòng lặp và xử lý lỗi trong Shell; chưa yêu cầu xây dựng chức năng Web.</w:t>
+        <w:t>Lớp CapacityPolicy nhận sức chứa và số người đã đăng ký, sau đó trả kết quả còn chỗ hoặc không thể đăng ký. Tách quy tắc khỏi giao diện giúp kiểm thử với nhiều bộ dữ liệu và sử dụng lại trong các trang của ứng dụng.</w:t>
       </w:r>
     </w:p>
-    <w:p>
-      <w:pPr>
-        <w:keepNext/>
-        <w:widowControl/>
-        <w:ind w:firstLine="0"/>
-        <w:jc w:val="center"/>
-      </w:pPr>
-      <w:r>
-        <w:rPr>
-          <w:b w:val="0"/>
-        </w:rPr>
-        <w:drawing>
-          <wp:inline xmlns:a="http://schemas.openxmlformats.org/drawingml/2006/main" xmlns:pic="http://schemas.openxmlformats.org/drawingml/2006/picture">
-            <wp:extent cx="5580000" cy="3487500"/>
-            <wp:docPr id="1" name="Picture 1" descr="Trang CommunityPass khi mã PHP đã chạy trên máy thực hành."/>
-            <wp:cNvGraphicFramePr>
-              <a:graphicFrameLocks noChangeAspect="1"/>
-            </wp:cNvGraphicFramePr>
-            <a:graphic>
-              <a:graphicData uri="http://schemas.openxmlformats.org/drawingml/2006/picture">
-                <pic:pic>
-                  <pic:nvPicPr>
-                    <pic:cNvPr id="0" name="buoi02_trang_chao.png"/>
-                    <pic:cNvPicPr/>
-                  </pic:nvPicPr>
-                  <pic:blipFill>
-                    <a:blip r:embed="rId10"/>
-                    <a:stretch>
-                      <a:fillRect/>
-                    </a:stretch>
-                  </pic:blipFill>
-                  <pic:spPr>
-                    <a:xfrm>
-                      <a:off x="0" y="0"/>
-                      <a:ext cx="5580000" cy="3487500"/>
-                    </a:xfrm>
-                    <a:prstGeom prst="rect"/>
-                  </pic:spPr>
-                </pic:pic>
-              </a:graphicData>
-            </a:graphic>
-          </wp:inline>
-        </w:drawing>
-      </w:r>
-    </w:p>
+    <w:tbl>
+      <w:tblPr>
+        <w:tblW w:type="auto" w:w="0"/>
+        <w:tblLayout w:type="fixed"/>
+        <w:tblLook w:firstColumn="1" w:firstRow="1" w:lastColumn="0" w:lastRow="0" w:noHBand="0" w:noVBand="1" w:val="04A0"/>
+        <w:tblBorders>
+          <w:top w:val="single" w:sz="4" w:color="000000"/>
+          <w:left w:val="single" w:sz="4" w:color="000000"/>
+          <w:bottom w:val="single" w:sz="4" w:color="000000"/>
+          <w:right w:val="single" w:sz="4" w:color="000000"/>
+          <w:insideH w:val="single" w:sz="4" w:color="000000"/>
+          <w:insideV w:val="single" w:sz="4" w:color="000000"/>
+        </w:tblBorders>
+      </w:tblPr>
+      <w:tblGrid>
+        <w:gridCol w:w="1701"/>
+        <w:gridCol w:w="7370"/>
+      </w:tblGrid>
+      <w:tr>
+        <w:trPr>
+          <w:cantSplit/>
+          <w:tblHeader/>
+        </w:trPr>
+        <w:tc>
+          <w:tcPr>
+            <w:tcW w:type="dxa" w:w="1701"/>
+            <w:tcMar>
+              <w:left w:w="75" w:type="dxa"/>
+              <w:right w:w="75" w:type="dxa"/>
+            </w:tcMar>
+          </w:tcPr>
+          <w:p>
+            <w:pPr>
+              <w:widowControl/>
+              <w:spacing w:line="240" w:lineRule="auto" w:after="80" w:before="80"/>
+              <w:ind w:firstLine="0"/>
+              <w:jc w:val="left"/>
+            </w:pPr>
+            <w:r>
+              <w:rPr>
+                <w:rFonts w:ascii="Times New Roman" w:hAnsi="Times New Roman"/>
+                <w:b/>
+                <w:color w:val="000000"/>
+                <w:sz w:val="26"/>
+              </w:rPr>
+              <w:t>Đầu vào</w:t>
+            </w:r>
+          </w:p>
+        </w:tc>
+        <w:tc>
+          <w:tcPr>
+            <w:tcW w:type="dxa" w:w="7370"/>
+            <w:tcMar>
+              <w:left w:w="75" w:type="dxa"/>
+              <w:right w:w="75" w:type="dxa"/>
+            </w:tcMar>
+          </w:tcPr>
+          <w:p>
+            <w:pPr>
+              <w:widowControl/>
+              <w:spacing w:line="240" w:lineRule="auto" w:after="80" w:before="80"/>
+              <w:ind w:firstLine="0"/>
+              <w:jc w:val="left"/>
+            </w:pPr>
+            <w:r>
+              <w:rPr>
+                <w:rFonts w:ascii="Times New Roman" w:hAnsi="Times New Roman"/>
+                <w:b/>
+                <w:color w:val="000000"/>
+                <w:sz w:val="26"/>
+              </w:rPr>
+              <w:t>Kết quả mẫu</w:t>
+            </w:r>
+          </w:p>
+        </w:tc>
+      </w:tr>
+      <w:tr>
+        <w:trPr>
+          <w:cantSplit/>
+        </w:trPr>
+        <w:tc>
+          <w:tcPr>
+            <w:tcW w:type="dxa" w:w="1701"/>
+            <w:tcMar>
+              <w:left w:w="75" w:type="dxa"/>
+              <w:right w:w="75" w:type="dxa"/>
+            </w:tcMar>
+          </w:tcPr>
+          <w:p>
+            <w:pPr>
+              <w:widowControl/>
+              <w:spacing w:line="240" w:lineRule="auto" w:after="80" w:before="80"/>
+              <w:ind w:firstLine="0"/>
+              <w:jc w:val="left"/>
+            </w:pPr>
+            <w:r>
+              <w:rPr>
+                <w:rFonts w:ascii="Times New Roman" w:hAnsi="Times New Roman"/>
+                <w:b w:val="0"/>
+                <w:color w:val="000000"/>
+                <w:sz w:val="26"/>
+              </w:rPr>
+              <w:t>Sức chứa 10, hiện có 9</w:t>
+            </w:r>
+          </w:p>
+        </w:tc>
+        <w:tc>
+          <w:tcPr>
+            <w:tcW w:type="dxa" w:w="7370"/>
+            <w:tcMar>
+              <w:left w:w="75" w:type="dxa"/>
+              <w:right w:w="75" w:type="dxa"/>
+            </w:tcMar>
+          </w:tcPr>
+          <w:p>
+            <w:pPr>
+              <w:widowControl/>
+              <w:spacing w:line="240" w:lineRule="auto" w:after="80" w:before="80"/>
+              <w:ind w:firstLine="0"/>
+              <w:jc w:val="left"/>
+            </w:pPr>
+            <w:r>
+              <w:rPr>
+                <w:rFonts w:ascii="Times New Roman" w:hAnsi="Times New Roman"/>
+                <w:b w:val="0"/>
+                <w:color w:val="000000"/>
+                <w:sz w:val="26"/>
+              </w:rPr>
+              <w:t>true</w:t>
+            </w:r>
+            <w:r>
+              <w:rPr>
+                <w:rFonts w:ascii="Times New Roman" w:hAnsi="Times New Roman"/>
+                <w:b w:val="0"/>
+                <w:color w:val="000000"/>
+                <w:sz w:val="26"/>
+              </w:rPr>
+              <w:t xml:space="preserve">, chương trình minh họa in </w:t>
+            </w:r>
+            <w:r>
+              <w:rPr>
+                <w:rFonts w:ascii="Times New Roman" w:hAnsi="Times New Roman"/>
+                <w:b w:val="0"/>
+                <w:color w:val="000000"/>
+                <w:sz w:val="26"/>
+              </w:rPr>
+              <w:t>AVAILABLE</w:t>
+            </w:r>
+            <w:r>
+              <w:rPr>
+                <w:rFonts w:ascii="Times New Roman" w:hAnsi="Times New Roman"/>
+                <w:b w:val="0"/>
+                <w:color w:val="000000"/>
+                <w:sz w:val="26"/>
+              </w:rPr>
+              <w:t>.</w:t>
+            </w:r>
+          </w:p>
+        </w:tc>
+      </w:tr>
+      <w:tr>
+        <w:trPr>
+          <w:cantSplit/>
+        </w:trPr>
+        <w:tc>
+          <w:tcPr>
+            <w:tcW w:type="dxa" w:w="1701"/>
+            <w:tcMar>
+              <w:left w:w="75" w:type="dxa"/>
+              <w:right w:w="75" w:type="dxa"/>
+            </w:tcMar>
+          </w:tcPr>
+          <w:p>
+            <w:pPr>
+              <w:widowControl/>
+              <w:spacing w:line="240" w:lineRule="auto" w:after="80" w:before="80"/>
+              <w:ind w:firstLine="0"/>
+              <w:jc w:val="left"/>
+            </w:pPr>
+            <w:r>
+              <w:rPr>
+                <w:rFonts w:ascii="Times New Roman" w:hAnsi="Times New Roman"/>
+                <w:b w:val="0"/>
+                <w:color w:val="000000"/>
+                <w:sz w:val="26"/>
+              </w:rPr>
+              <w:t>Sức chứa 10, hiện có 10</w:t>
+            </w:r>
+          </w:p>
+        </w:tc>
+        <w:tc>
+          <w:tcPr>
+            <w:tcW w:type="dxa" w:w="7370"/>
+            <w:tcMar>
+              <w:left w:w="75" w:type="dxa"/>
+              <w:right w:w="75" w:type="dxa"/>
+            </w:tcMar>
+          </w:tcPr>
+          <w:p>
+            <w:pPr>
+              <w:widowControl/>
+              <w:spacing w:line="240" w:lineRule="auto" w:after="80" w:before="80"/>
+              <w:ind w:firstLine="0"/>
+              <w:jc w:val="left"/>
+            </w:pPr>
+            <w:r>
+              <w:rPr>
+                <w:rFonts w:ascii="Times New Roman" w:hAnsi="Times New Roman"/>
+                <w:b w:val="0"/>
+                <w:color w:val="000000"/>
+                <w:sz w:val="26"/>
+              </w:rPr>
+              <w:t>false</w:t>
+            </w:r>
+            <w:r>
+              <w:rPr>
+                <w:rFonts w:ascii="Times New Roman" w:hAnsi="Times New Roman"/>
+                <w:b w:val="0"/>
+                <w:color w:val="000000"/>
+                <w:sz w:val="26"/>
+              </w:rPr>
+              <w:t xml:space="preserve">, in </w:t>
+            </w:r>
+            <w:r>
+              <w:rPr>
+                <w:rFonts w:ascii="Times New Roman" w:hAnsi="Times New Roman"/>
+                <w:b w:val="0"/>
+                <w:color w:val="000000"/>
+                <w:sz w:val="26"/>
+              </w:rPr>
+              <w:t>FULL</w:t>
+            </w:r>
+            <w:r>
+              <w:rPr>
+                <w:rFonts w:ascii="Times New Roman" w:hAnsi="Times New Roman"/>
+                <w:b w:val="0"/>
+                <w:color w:val="000000"/>
+                <w:sz w:val="26"/>
+              </w:rPr>
+              <w:t>.</w:t>
+            </w:r>
+          </w:p>
+        </w:tc>
+      </w:tr>
+      <w:tr>
+        <w:trPr>
+          <w:cantSplit/>
+        </w:trPr>
+        <w:tc>
+          <w:tcPr>
+            <w:tcW w:type="dxa" w:w="1701"/>
+            <w:tcMar>
+              <w:left w:w="75" w:type="dxa"/>
+              <w:right w:w="75" w:type="dxa"/>
+            </w:tcMar>
+          </w:tcPr>
+          <w:p>
+            <w:pPr>
+              <w:widowControl/>
+              <w:spacing w:line="240" w:lineRule="auto" w:after="80" w:before="80"/>
+              <w:ind w:firstLine="0"/>
+              <w:jc w:val="left"/>
+            </w:pPr>
+            <w:r>
+              <w:rPr>
+                <w:rFonts w:ascii="Times New Roman" w:hAnsi="Times New Roman"/>
+                <w:b w:val="0"/>
+                <w:color w:val="000000"/>
+                <w:sz w:val="26"/>
+              </w:rPr>
+              <w:t>Sức chứa 0 hoặc số đã đăng ký âm</w:t>
+            </w:r>
+          </w:p>
+        </w:tc>
+        <w:tc>
+          <w:tcPr>
+            <w:tcW w:type="dxa" w:w="7370"/>
+            <w:tcMar>
+              <w:left w:w="75" w:type="dxa"/>
+              <w:right w:w="75" w:type="dxa"/>
+            </w:tcMar>
+          </w:tcPr>
+          <w:p>
+            <w:pPr>
+              <w:widowControl/>
+              <w:spacing w:line="240" w:lineRule="auto" w:after="80" w:before="80"/>
+              <w:ind w:firstLine="0"/>
+              <w:jc w:val="left"/>
+            </w:pPr>
+            <w:r>
+              <w:rPr>
+                <w:rFonts w:ascii="Times New Roman" w:hAnsi="Times New Roman"/>
+                <w:b w:val="0"/>
+                <w:color w:val="000000"/>
+                <w:sz w:val="26"/>
+              </w:rPr>
+              <w:t>false</w:t>
+            </w:r>
+            <w:r>
+              <w:rPr>
+                <w:rFonts w:ascii="Times New Roman" w:hAnsi="Times New Roman"/>
+                <w:b w:val="0"/>
+                <w:color w:val="000000"/>
+                <w:sz w:val="26"/>
+              </w:rPr>
+              <w:t>, dữ liệu không hợp lệ.</w:t>
+            </w:r>
+          </w:p>
+        </w:tc>
+      </w:tr>
+    </w:tbl>
     <w:p>
       <w:pPr>
         <w:widowControl/>
-        <w:ind w:firstLine="0"/>
-        <w:jc w:val="center"/>
+        <w:spacing w:after="0"/>
       </w:pPr>
-      <w:r>
-        <w:rPr>
-          <w:rFonts w:ascii="Times New Roman" w:hAnsi="Times New Roman"/>
-          <w:b w:val="0"/>
-          <w:i/>
-          <w:sz w:val="26"/>
-        </w:rPr>
-        <w:t>Trang mẫu dùng để kiểm tra môi trường</w:t>
-      </w:r>
     </w:p>
     <w:p>
       <w:pPr>
@@ -329,13 +586,25 @@
           <w:color w:val="000000"/>
           <w:sz w:val="26"/>
         </w:rPr>
-        <w:t>Kết quả mẫu: trình duyệt hiển thị CommunityPass và dòng “Mã nguồn PHP đã chạy trên máy của bạn”.</w:t>
+        <w:t xml:space="preserve">Trong mẫu đơn giản, </w:t>
       </w:r>
-    </w:p>
-    <w:p>
-      <w:pPr/>
       <w:r>
-        <w:t>Giao diện Material 3 dùng public/assets/css/tokens.css và app.css trong chính lab. Trang Web vẫn chỉ kiểm tra môi trường; phần shell và bài tự làm giữ nguyên.</w:t>
+        <w:rPr>
+          <w:rFonts w:ascii="Times New Roman" w:hAnsi="Times New Roman"/>
+          <w:b w:val="0"/>
+          <w:color w:val="000000"/>
+          <w:sz w:val="26"/>
+        </w:rPr>
+        <w:t>FULL</w:t>
+      </w:r>
+      <w:r>
+        <w:rPr>
+          <w:rFonts w:ascii="Times New Roman" w:hAnsi="Times New Roman"/>
+          <w:b w:val="0"/>
+          <w:color w:val="000000"/>
+          <w:sz w:val="26"/>
+        </w:rPr>
+        <w:t xml:space="preserve"> là nhãn chung cho kết quả không thể đăng ký; chưa phân biệt hết chỗ với dữ liệu sai. Phần tự mở rộng sẽ thiết kế kết quả rõ hơn.</w:t>
       </w:r>
     </w:p>
     <w:p>
@@ -366,8 +635,8 @@
         </w:rPr>
         <w:drawing>
           <wp:inline xmlns:a="http://schemas.openxmlformats.org/drawingml/2006/main" xmlns:pic="http://schemas.openxmlformats.org/drawingml/2006/picture">
-            <wp:extent cx="4612363" cy="5544000"/>
-            <wp:docPr id="2" name="Picture 2" descr="Quy trình thực hiện và kiểm tra Lab 01."/>
+            <wp:extent cx="4616565" cy="5544000"/>
+            <wp:docPr id="1" name="Picture 1" descr="Quy trình thực hiện và kiểm tra Lab 02."/>
             <wp:cNvGraphicFramePr>
               <a:graphicFrameLocks noChangeAspect="1"/>
             </wp:cNvGraphicFramePr>
@@ -375,11 +644,11 @@
               <a:graphicData uri="http://schemas.openxmlformats.org/drawingml/2006/picture">
                 <pic:pic>
                   <pic:nvPicPr>
-                    <pic:cNvPr id="0" name="lab01_huong_lam.png"/>
+                    <pic:cNvPr id="0" name="lab02_huong_lam.png"/>
                     <pic:cNvPicPr/>
                   </pic:nvPicPr>
                   <pic:blipFill>
-                    <a:blip r:embed="rId11"/>
+                    <a:blip r:embed="rId10"/>
                     <a:stretch>
                       <a:fillRect/>
                     </a:stretch>
@@ -387,7 +656,7 @@
                   <pic:spPr>
                     <a:xfrm>
                       <a:off x="0" y="0"/>
-                      <a:ext cx="4612363" cy="5544000"/>
+                      <a:ext cx="4616565" cy="5544000"/>
                     </a:xfrm>
                     <a:prstGeom prst="rect"/>
                   </pic:spPr>
@@ -411,7 +680,7 @@
           <w:i/>
           <w:sz w:val="26"/>
         </w:rPr>
-        <w:t>Sơ đồ hướng thực hiện Lab 01</w:t>
+        <w:t>Sơ đồ hướng thực hiện Lab 02</w:t>
       </w:r>
     </w:p>
     <w:p>
@@ -438,7 +707,7 @@
           <w:b w:val="0"/>
           <w:sz w:val="26"/>
         </w:rPr>
-        <w:t>Mở thư mục Lab01/Ma_nguon bằng trình soạn thảo và mở terminal Ubuntu tại thư mục này. Chạy pwd và ls để kiểm tra vị trí; danh sách tệp cần có lab.sh. Các đường dẫn trong bài được tính từ Ma_nguon. Trên Windows, thực hiện lệnh Bash trong Ubuntu/WSL.</w:t>
+        <w:t>Mở thư mục Lab02/Ma_nguon bằng trình soạn thảo và mở terminal Ubuntu tại thư mục này. Chạy pwd và ls để kiểm tra vị trí; danh sách tệp cần có lab.sh. Các đường dẫn trong bài được tính từ Ma_nguon. Trên Windows, thực hiện lệnh Bash trong Ubuntu/WSL.</w:t>
       </w:r>
     </w:p>
     <w:p>
@@ -495,7 +764,7 @@
           <w:color w:val="000000"/>
           <w:sz w:val="26"/>
         </w:rPr>
-        <w:t xml:space="preserve"> mở </w:t>
+        <w:t xml:space="preserve"> chương trình </w:t>
       </w:r>
       <w:r>
         <w:rPr>
@@ -504,7 +773,7 @@
           <w:color w:val="000000"/>
           <w:sz w:val="26"/>
         </w:rPr>
-        <w:t>http://127.0.0.1:8101</w:t>
+        <w:t>demo.php</w:t>
       </w:r>
       <w:r>
         <w:rPr>
@@ -513,25 +782,7 @@
           <w:color w:val="000000"/>
           <w:sz w:val="26"/>
         </w:rPr>
-        <w:t xml:space="preserve">. Giữ terminal máy chủ mở, dùng terminal thứ hai tại cùng thư mục để sửa/chạy test. Dừng bằng </w:t>
-      </w:r>
-      <w:r>
-        <w:rPr>
-          <w:rFonts w:ascii="Times New Roman" w:hAnsi="Times New Roman"/>
-          <w:b w:val="0"/>
-          <w:color w:val="000000"/>
-          <w:sz w:val="26"/>
-        </w:rPr>
-        <w:t>Ctrl+C</w:t>
-      </w:r>
-      <w:r>
-        <w:rPr>
-          <w:rFonts w:ascii="Times New Roman" w:hAnsi="Times New Roman"/>
-          <w:b w:val="0"/>
-          <w:color w:val="000000"/>
-          <w:sz w:val="26"/>
-        </w:rPr>
-        <w:t>; không mở hai máy chủ cùng cổng.</w:t>
+        <w:t xml:space="preserve"> in kết quả trong terminal rồi kết thúc; bài này không có trang Web.</w:t>
       </w:r>
     </w:p>
     <w:p>
@@ -611,7 +862,7 @@
     <w:p>
       <w:pPr/>
       <w:r>
-        <w:t>Thư mục Lab01/Ma_nguon đã có mã mẫu cho phần hướng dẫn. Chạy mẫu trước để xem kết quả, sau đó đọc và thực hiện lại các bước ở phần IV trên chính các tệp đó. Khi bài yêu cầu thay toàn bộ nội dung, không chép nối thêm một hàm hoặc lớp trùng tên. Phần mở rộng để sinh viên tự hoàn thiện ở mục VI.</w:t>
+        <w:t>Thư mục Lab02/Ma_nguon đã có mã mẫu cho phần hướng dẫn. Chạy mẫu trước để xem kết quả, sau đó đọc và thực hiện lại các bước ở phần IV trên chính các tệp đó. Khi bài yêu cầu thay toàn bộ nội dung, không chép nối thêm một hàm hoặc lớp trùng tên. Phần mở rộng để sinh viên tự hoàn thiện ở mục VI.</w:t>
       </w:r>
     </w:p>
     <w:tbl>
@@ -755,9 +1006,9 @@
                 <w:color w:val="000000"/>
                 <w:sz w:val="26"/>
               </w:rPr>
-              <w:t>scripts/check-env.sh; public/index.php</w:t>
+              <w:t>src/CapacityPolicy.php; demo.php</w:t>
               <w:br/>
-              <w:t>Đọc trang PHP đã cấp; viết lại script kiểm tra PHP, Git và các tệp của dự án theo từng bước ở phần IV.</w:t>
+              <w:t>Đọc và viết lại lớp CapacityPolicy cùng chương trình gọi. Kiểm tra sức chứa, số người hiện tại và điều kiện còn chỗ.</w:t>
             </w:r>
           </w:p>
         </w:tc>
@@ -780,7 +1031,7 @@
                 <w:color w:val="000000"/>
                 <w:sz w:val="26"/>
               </w:rPr>
-              <w:t>bash lab.sh test: có CHECK_ENV=PASS, mã thoát 0. Trang mẫu ở cổng 8101.</w:t>
+              <w:t>bash lab.sh run: AVAILABLE với (10, 9). bash lab.sh test: TESTS=5 FAILED=0.</w:t>
             </w:r>
           </w:p>
         </w:tc>
@@ -831,9 +1082,9 @@
                 <w:color w:val="000000"/>
                 <w:sz w:val="26"/>
               </w:rPr>
-              <w:t>scripts/scan-source.sh</w:t>
+              <w:t>src/RegistrationPolicy.php</w:t>
               <w:br/>
-              <w:t>Hoàn thiện ba vị trí TODO: kiểm tra thư mục, đếm tệp đúng/sai và trả mã kết quả. Kiểm tra cả thư mục con và tên có khoảng trắng.</w:t>
+              <w:t>Viết phương thức decide để trả confirmed, waiting hoặc rejected; xử lý dữ liệu sai, sự kiện đóng và danh sách chờ.</w:t>
             </w:r>
           </w:p>
         </w:tc>
@@ -856,7 +1107,7 @@
                 <w:color w:val="000000"/>
                 <w:sz w:val="26"/>
               </w:rPr>
-              <w:t>bash lab.sh extend: SHELL_CASES=4 FAILED=0. Có tệp sai: vẫn kiểm tra đủ tệp; thiếu/rỗng: mã 2.</w:t>
+              <w:t>Bộ 8 ca đã cấp: TESTS=8 FAILED=0. Nếu bổ sung ca, tổng TESTS tăng tương ứng; FAILED phải bằng 0.</w:t>
             </w:r>
           </w:p>
         </w:tc>
@@ -915,7 +1166,7 @@
                 <w:color w:val="000000"/>
                 <w:sz w:val="26"/>
               </w:rPr>
-              <w:t>Tệp/thư mục</w:t>
+              <w:t>Tệp</w:t>
             </w:r>
           </w:p>
         </w:tc>
@@ -937,9 +1188,11 @@
             <w:r>
               <w:rPr>
                 <w:rFonts w:ascii="Times New Roman" w:hAnsi="Times New Roman"/>
+                <w:b/>
+                <w:color w:val="000000"/>
                 <w:sz w:val="26"/>
               </w:rPr>
-              <w:t>Chức năng</w:t>
+              <w:t>Vai trò</w:t>
             </w:r>
           </w:p>
         </w:tc>
@@ -970,7 +1223,7 @@
                 <w:color w:val="000000"/>
                 <w:sz w:val="26"/>
               </w:rPr>
-              <w:t>public/index.php</w:t>
+              <w:t>src/CapacityPolicy.php</w:t>
             </w:r>
           </w:p>
         </w:tc>
@@ -996,7 +1249,7 @@
                 <w:color w:val="000000"/>
                 <w:sz w:val="26"/>
               </w:rPr>
-              <w:t>Trang Web được cấp sẵn; máy chủ PHP trả trang này cho trình duyệt.</w:t>
+              <w:t>Mã mẫu xét điều kiện còn chỗ; đọc và viết lại theo bước 3.</w:t>
             </w:r>
           </w:p>
         </w:tc>
@@ -1027,7 +1280,7 @@
                 <w:color w:val="000000"/>
                 <w:sz w:val="26"/>
               </w:rPr>
-              <w:t>README.md</w:t>
+              <w:t>demo.php</w:t>
             </w:r>
           </w:p>
         </w:tc>
@@ -1053,7 +1306,7 @@
                 <w:color w:val="000000"/>
                 <w:sz w:val="26"/>
               </w:rPr>
-              <w:t>Hướng dẫn giới thiệu và sử dụng dự án.</w:t>
+              <w:t>Tạo đối tượng, truyền đầu vào và in kết quả. Đọc và viết lại theo bước 4.</w:t>
             </w:r>
           </w:p>
         </w:tc>
@@ -1084,7 +1337,7 @@
                 <w:color w:val="000000"/>
                 <w:sz w:val="26"/>
               </w:rPr>
-              <w:t>LICENSE</w:t>
+              <w:t>tests/run.php</w:t>
             </w:r>
           </w:p>
         </w:tc>
@@ -1110,7 +1363,7 @@
                 <w:color w:val="000000"/>
                 <w:sz w:val="26"/>
               </w:rPr>
-              <w:t>Văn bản giấy phép của mã mẫu. Chỉ đọc, không tự xóa tên tác giả.</w:t>
+              <w:t>Bộ dữ liệu thử đã cấp để kiểm tra hành vi của lớp.</w:t>
             </w:r>
           </w:p>
         </w:tc>
@@ -1141,7 +1394,7 @@
                 <w:color w:val="000000"/>
                 <w:sz w:val="26"/>
               </w:rPr>
-              <w:t>scripts/check-env.sh</w:t>
+              <w:t>tests/helper.php</w:t>
             </w:r>
           </w:p>
         </w:tc>
@@ -1167,7 +1420,7 @@
                 <w:color w:val="000000"/>
                 <w:sz w:val="26"/>
               </w:rPr>
-              <w:t>Tệp bạn đọc và viết lại để kiểm tra môi trường và tệp dự án.</w:t>
+              <w:t>Hàm so sánh kết quả mong đợi và kết quả thật; không cần sửa.</w:t>
             </w:r>
           </w:p>
         </w:tc>
@@ -1187,9 +1440,28 @@
         <w:rPr>
           <w:rFonts w:ascii="Times New Roman" w:hAnsi="Times New Roman"/>
           <w:b w:val="0"/>
+          <w:color w:val="000000"/>
           <w:sz w:val="26"/>
         </w:rPr>
-        <w:t>Bash thực hiện các lệnh trong script, thông báo điều kiện đạt hoặc thiếu, sau đó trả mã kết quả cho chương trình gọi. Việc kiểm tra LICENSE trong bài chỉ xác nhận tệp tồn tại, không đánh giá nội dung hoặc việc tuân thủ giấy phép.</w:t>
+        <w:t xml:space="preserve">Luồng: </w:t>
+      </w:r>
+      <w:r>
+        <w:rPr>
+          <w:rFonts w:ascii="Times New Roman" w:hAnsi="Times New Roman"/>
+          <w:b w:val="0"/>
+          <w:color w:val="000000"/>
+          <w:sz w:val="26"/>
+        </w:rPr>
+        <w:t>demo.php</w:t>
+      </w:r>
+      <w:r>
+        <w:rPr>
+          <w:rFonts w:ascii="Times New Roman" w:hAnsi="Times New Roman"/>
+          <w:b w:val="0"/>
+          <w:color w:val="000000"/>
+          <w:sz w:val="26"/>
+        </w:rPr>
+        <w:t xml:space="preserve"> nạp lớp → tạo đối tượng → gọi phương thức với hai số nguyên → nhận Boolean → quyết định dòng chữ cần in. Không có database hoặc Session trong luồng này.</w:t>
       </w:r>
     </w:p>
     <w:p>
@@ -1220,74 +1492,7 @@
           <w:color w:val="000000"/>
           <w:sz w:val="26"/>
         </w:rPr>
-        <w:t>Bước 1. Thử ba lệnh mà script sẽ sử dụng</w:t>
-      </w:r>
-    </w:p>
-    <w:p>
-      <w:pPr>
-        <w:keepNext/>
-        <w:widowControl/>
-      </w:pPr>
-      <w:r>
-        <w:rPr>
-          <w:rFonts w:ascii="Times New Roman" w:hAnsi="Times New Roman"/>
-          <w:b w:val="0"/>
-          <w:color w:val="000000"/>
-          <w:sz w:val="26"/>
-        </w:rPr>
-        <w:t>Trong terminal đang ở Ma_nguon, chạy từng dòng:</w:t>
-      </w:r>
-    </w:p>
-    <w:p>
-      <w:pPr>
-        <w:keepNext/>
-        <w:keepLines/>
-        <w:widowControl/>
-        <w:spacing w:after="0" w:before="0" w:line="240" w:lineRule="auto"/>
-        <w:ind w:firstLine="0" w:left="142" w:right="85"/>
-        <w:jc w:val="left"/>
-      </w:pPr>
-      <w:r>
-        <w:rPr>
-          <w:rFonts w:ascii="Times New Roman" w:hAnsi="Times New Roman"/>
-          <w:b w:val="0"/>
-          <w:sz w:val="26"/>
-        </w:rPr>
-        <w:t>php -v</w:t>
-      </w:r>
-    </w:p>
-    <w:p>
-      <w:pPr>
-        <w:keepNext w:val="0"/>
-        <w:keepLines/>
-        <w:widowControl/>
-        <w:spacing w:after="0" w:before="0" w:line="240" w:lineRule="auto"/>
-        <w:ind w:firstLine="0" w:left="142" w:right="85"/>
-        <w:jc w:val="left"/>
-      </w:pPr>
-      <w:r>
-        <w:rPr>
-          <w:rFonts w:ascii="Times New Roman" w:hAnsi="Times New Roman"/>
-          <w:b w:val="0"/>
-          <w:sz w:val="26"/>
-        </w:rPr>
-        <w:t>git --version</w:t>
-      </w:r>
-    </w:p>
-    <w:p>
-      <w:pPr>
-        <w:widowControl/>
-        <w:spacing w:after="120" w:before="0" w:line="240" w:lineRule="auto"/>
-        <w:ind w:firstLine="0" w:left="142" w:right="85"/>
-        <w:jc w:val="left"/>
-      </w:pPr>
-      <w:r>
-        <w:rPr>
-          <w:rFonts w:ascii="Times New Roman" w:hAnsi="Times New Roman"/>
-          <w:b w:val="0"/>
-          <w:sz w:val="26"/>
-        </w:rPr>
-        <w:t>php -l public/index.php</w:t>
+        <w:t>Bước 1. Viết quy tắc bằng lời trước khi viết mã</w:t>
       </w:r>
     </w:p>
     <w:p>
@@ -1301,43 +1506,7 @@
           <w:color w:val="000000"/>
           <w:sz w:val="26"/>
         </w:rPr>
-        <w:t xml:space="preserve">Hai lệnh đầu in phiên bản công cụ. Lệnh thứ ba có chữ </w:t>
-      </w:r>
-      <w:r>
-        <w:rPr>
-          <w:rFonts w:ascii="Times New Roman" w:hAnsi="Times New Roman"/>
-          <w:b w:val="0"/>
-          <w:color w:val="000000"/>
-          <w:sz w:val="26"/>
-        </w:rPr>
-        <w:t>No syntax errors detected</w:t>
-      </w:r>
-      <w:r>
-        <w:rPr>
-          <w:rFonts w:ascii="Times New Roman" w:hAnsi="Times New Roman"/>
-          <w:b w:val="0"/>
-          <w:color w:val="000000"/>
-          <w:sz w:val="26"/>
-        </w:rPr>
-        <w:t xml:space="preserve">. Tham số </w:t>
-      </w:r>
-      <w:r>
-        <w:rPr>
-          <w:rFonts w:ascii="Times New Roman" w:hAnsi="Times New Roman"/>
-          <w:b w:val="0"/>
-          <w:color w:val="000000"/>
-          <w:sz w:val="26"/>
-        </w:rPr>
-        <w:t>-l</w:t>
-      </w:r>
-      <w:r>
-        <w:rPr>
-          <w:rFonts w:ascii="Times New Roman" w:hAnsi="Times New Roman"/>
-          <w:b w:val="0"/>
-          <w:color w:val="000000"/>
-          <w:sz w:val="26"/>
-        </w:rPr>
-        <w:t xml:space="preserve"> yêu cầu PHP chỉ kiểm tra cú pháp tệp, không chạy chức năng của trang. Vì vậy một tệp đúng cú pháp vẫn có thể sai nghiệp vụ.</w:t>
+        <w:t>Trong ghi chú của bài, ghi: sức chứa phải lớn hơn 0; số đã đăng ký không âm; chỉ còn chỗ khi số đã đăng ký nhỏ hơn sức chứa. Với mẫu này, nếu số đã đăng ký lớn hơn sức chứa thì cũng không cho đăng ký tiếp.</w:t>
       </w:r>
     </w:p>
     <w:p>
@@ -1351,36 +1520,43 @@
           <w:color w:val="000000"/>
           <w:sz w:val="26"/>
         </w:rPr>
-        <w:t>Để xem lệnh có tồn tại trong môi trường, thử:</w:t>
+        <w:t xml:space="preserve">Câu “còn chỗ” được biểu diễn bằng toán tử </w:t>
       </w:r>
-    </w:p>
-    <w:p>
-      <w:pPr>
-        <w:widowControl/>
-        <w:spacing w:after="120" w:before="0" w:line="240" w:lineRule="auto"/>
-        <w:ind w:firstLine="0" w:left="142" w:right="85"/>
-        <w:jc w:val="left"/>
-      </w:pPr>
       <w:r>
         <w:rPr>
           <w:rFonts w:ascii="Times New Roman" w:hAnsi="Times New Roman"/>
           <w:b w:val="0"/>
+          <w:color w:val="000000"/>
           <w:sz w:val="26"/>
         </w:rPr>
-        <w:t>command -v php</w:t>
+        <w:t>&lt;</w:t>
       </w:r>
-    </w:p>
-    <w:p>
-      <w:pPr>
-        <w:widowControl/>
-      </w:pPr>
       <w:r>
         <w:rPr>
           <w:rFonts w:ascii="Times New Roman" w:hAnsi="Times New Roman"/>
           <w:b w:val="0"/>
+          <w:color w:val="000000"/>
           <w:sz w:val="26"/>
         </w:rPr>
-        <w:t>Lệnh trả về đường dẫn đến PHP, chẳng hạn /usr/bin/php. Đường dẫn cụ thể phụ thuộc môi trường cài đặt.</w:t>
+        <w:t xml:space="preserve">, không phải </w:t>
+      </w:r>
+      <w:r>
+        <w:rPr>
+          <w:rFonts w:ascii="Times New Roman" w:hAnsi="Times New Roman"/>
+          <w:b w:val="0"/>
+          <w:color w:val="000000"/>
+          <w:sz w:val="26"/>
+        </w:rPr>
+        <w:t>&lt;=</w:t>
+      </w:r>
+      <w:r>
+        <w:rPr>
+          <w:rFonts w:ascii="Times New Roman" w:hAnsi="Times New Roman"/>
+          <w:b w:val="0"/>
+          <w:color w:val="000000"/>
+          <w:sz w:val="26"/>
+        </w:rPr>
+        <w:t>. Đây là quyết định nghiệp vụ, không phải quy ước đặt tên.</w:t>
       </w:r>
     </w:p>
     <w:p>
@@ -1419,7 +1595,7 @@
           <w:color w:val="000000"/>
           <w:sz w:val="26"/>
         </w:rPr>
-        <w:t xml:space="preserve"> ] Lệnh in phiên bản PHP/Git và thông báo không lỗi cú pháp; biết -l chỉ kiểm tra cú pháp.</w:t>
+        <w:t xml:space="preserve"> ] Viết được điều kiện còn chỗ và quy tắc từ chối đầu vào không hợp lệ.</w:t>
       </w:r>
     </w:p>
     <w:p>
@@ -1435,7 +1611,7 @@
           <w:color w:val="000000"/>
           <w:sz w:val="26"/>
         </w:rPr>
-        <w:t>Bước 2. Tạo tệp Shell và chạy phiên bản đầu tiên</w:t>
+        <w:t>Bước 2. Thử quy tắc dưới dạng một hàm</w:t>
       </w:r>
     </w:p>
     <w:p>
@@ -1450,7 +1626,7 @@
           <w:color w:val="000000"/>
           <w:sz w:val="26"/>
         </w:rPr>
-        <w:t xml:space="preserve">Trong trình soạn thảo, tạo thư mục </w:t>
+        <w:t xml:space="preserve">Mở tệp </w:t>
       </w:r>
       <w:r>
         <w:rPr>
@@ -1459,7 +1635,7 @@
           <w:color w:val="000000"/>
           <w:sz w:val="26"/>
         </w:rPr>
-        <w:t>scripts</w:t>
+        <w:t>thu-ham.php</w:t>
       </w:r>
       <w:r>
         <w:rPr>
@@ -1468,25 +1644,7 @@
           <w:color w:val="000000"/>
           <w:sz w:val="26"/>
         </w:rPr>
-        <w:t xml:space="preserve"> nếu chưa có. Mở tệp </w:t>
-      </w:r>
-      <w:r>
-        <w:rPr>
-          <w:rFonts w:ascii="Times New Roman" w:hAnsi="Times New Roman"/>
-          <w:b w:val="0"/>
-          <w:color w:val="000000"/>
-          <w:sz w:val="26"/>
-        </w:rPr>
-        <w:t>scripts/check-env.sh</w:t>
-      </w:r>
-      <w:r>
-        <w:rPr>
-          <w:rFonts w:ascii="Times New Roman" w:hAnsi="Times New Roman"/>
-          <w:b w:val="0"/>
-          <w:color w:val="000000"/>
-          <w:sz w:val="26"/>
-        </w:rPr>
-        <w:t xml:space="preserve"> và thay toàn bộ nội dung bằng đoạn sau:</w:t>
+        <w:t xml:space="preserve"> tại thư mục gốc bài làm với nội dung:</w:t>
       </w:r>
     </w:p>
     <w:p>
@@ -1504,7 +1662,115 @@
           <w:b w:val="0"/>
           <w:sz w:val="26"/>
         </w:rPr>
-        <w:t>#!/usr/bin/env bash</w:t>
+        <w:t>&lt;?php</w:t>
+      </w:r>
+    </w:p>
+    <w:p>
+      <w:pPr>
+        <w:keepNext/>
+        <w:keepLines/>
+        <w:widowControl/>
+        <w:spacing w:after="0" w:before="0" w:line="240" w:lineRule="auto"/>
+        <w:ind w:firstLine="0" w:left="142" w:right="85"/>
+        <w:jc w:val="left"/>
+      </w:pPr>
+      <w:r>
+        <w:rPr>
+          <w:rFonts w:ascii="Times New Roman" w:hAnsi="Times New Roman"/>
+          <w:b w:val="0"/>
+          <w:sz w:val="26"/>
+        </w:rPr>
+        <w:t>function canRegister(int $capacity, int $registered): bool</w:t>
+      </w:r>
+    </w:p>
+    <w:p>
+      <w:pPr>
+        <w:keepNext/>
+        <w:keepLines/>
+        <w:widowControl/>
+        <w:spacing w:after="0" w:before="0" w:line="240" w:lineRule="auto"/>
+        <w:ind w:firstLine="0" w:left="142" w:right="85"/>
+        <w:jc w:val="left"/>
+      </w:pPr>
+      <w:r>
+        <w:rPr>
+          <w:rFonts w:ascii="Times New Roman" w:hAnsi="Times New Roman"/>
+          <w:b w:val="0"/>
+          <w:sz w:val="26"/>
+        </w:rPr>
+        <w:t>{</w:t>
+      </w:r>
+    </w:p>
+    <w:p>
+      <w:pPr>
+        <w:keepNext/>
+        <w:keepLines/>
+        <w:widowControl/>
+        <w:spacing w:after="0" w:before="0" w:line="240" w:lineRule="auto"/>
+        <w:ind w:firstLine="0" w:left="142" w:right="85"/>
+        <w:jc w:val="left"/>
+      </w:pPr>
+      <w:r>
+        <w:rPr>
+          <w:rFonts w:ascii="Times New Roman" w:hAnsi="Times New Roman"/>
+          <w:b w:val="0"/>
+          <w:sz w:val="26"/>
+        </w:rPr>
+        <w:t xml:space="preserve">    if ($capacity &lt;= 0 || $registered &lt; 0) {</w:t>
+      </w:r>
+    </w:p>
+    <w:p>
+      <w:pPr>
+        <w:keepNext/>
+        <w:keepLines/>
+        <w:widowControl/>
+        <w:spacing w:after="0" w:before="0" w:line="240" w:lineRule="auto"/>
+        <w:ind w:firstLine="0" w:left="142" w:right="85"/>
+        <w:jc w:val="left"/>
+      </w:pPr>
+      <w:r>
+        <w:rPr>
+          <w:rFonts w:ascii="Times New Roman" w:hAnsi="Times New Roman"/>
+          <w:b w:val="0"/>
+          <w:sz w:val="26"/>
+        </w:rPr>
+        <w:t xml:space="preserve">        return false;</w:t>
+      </w:r>
+    </w:p>
+    <w:p>
+      <w:pPr>
+        <w:keepNext/>
+        <w:keepLines/>
+        <w:widowControl/>
+        <w:spacing w:after="0" w:before="0" w:line="240" w:lineRule="auto"/>
+        <w:ind w:firstLine="0" w:left="142" w:right="85"/>
+        <w:jc w:val="left"/>
+      </w:pPr>
+      <w:r>
+        <w:rPr>
+          <w:rFonts w:ascii="Times New Roman" w:hAnsi="Times New Roman"/>
+          <w:b w:val="0"/>
+          <w:sz w:val="26"/>
+        </w:rPr>
+        <w:t xml:space="preserve">    }</w:t>
+      </w:r>
+    </w:p>
+    <w:p>
+      <w:pPr>
+        <w:keepNext/>
+        <w:keepLines/>
+        <w:widowControl/>
+        <w:spacing w:after="0" w:before="0" w:line="240" w:lineRule="auto"/>
+        <w:ind w:firstLine="0" w:left="142" w:right="85"/>
+        <w:jc w:val="left"/>
+      </w:pPr>
+      <w:r>
+        <w:rPr>
+          <w:rFonts w:ascii="Times New Roman" w:hAnsi="Times New Roman"/>
+          <w:b w:val="0"/>
+          <w:sz w:val="26"/>
+        </w:rPr>
+        <w:t xml:space="preserve">    return $registered &lt; $capacity;</w:t>
       </w:r>
     </w:p>
     <w:p>
@@ -1522,7 +1788,41 @@
           <w:b w:val="0"/>
           <w:sz w:val="26"/>
         </w:rPr>
-        <w:t>project_name="CommunityPass"</w:t>
+        <w:t>}</w:t>
+      </w:r>
+    </w:p>
+    <w:p>
+      <w:pPr>
+        <w:widowControl/>
+        <w:spacing w:after="0" w:before="0" w:line="240" w:lineRule="auto"/>
+        <w:ind w:firstLine="0" w:left="142" w:right="85"/>
+        <w:jc w:val="left"/>
+      </w:pPr>
+      <w:r>
+        <w:rPr>
+          <w:rFonts w:ascii="Times New Roman" w:hAnsi="Times New Roman"/>
+          <w:b w:val="0"/>
+          <w:sz w:val="26"/>
+        </w:rPr>
+        <w:t xml:space="preserve"> </w:t>
+      </w:r>
+    </w:p>
+    <w:p>
+      <w:pPr>
+        <w:keepNext w:val="0"/>
+        <w:keepLines/>
+        <w:widowControl/>
+        <w:spacing w:after="0" w:before="0" w:line="240" w:lineRule="auto"/>
+        <w:ind w:firstLine="0" w:left="142" w:right="85"/>
+        <w:jc w:val="left"/>
+      </w:pPr>
+      <w:r>
+        <w:rPr>
+          <w:rFonts w:ascii="Times New Roman" w:hAnsi="Times New Roman"/>
+          <w:b w:val="0"/>
+          <w:sz w:val="26"/>
+        </w:rPr>
+        <w:t>var_dump(canRegister(10, 9));</w:t>
       </w:r>
     </w:p>
     <w:p>
@@ -1538,7 +1838,7 @@
           <w:b w:val="0"/>
           <w:sz w:val="26"/>
         </w:rPr>
-        <w:t>echo "Kiểm tra dự án: $project_name"</w:t>
+        <w:t>var_dump(canRegister(10, 10));</w:t>
       </w:r>
     </w:p>
     <w:p>
@@ -1552,37 +1852,7 @@
           <w:color w:val="000000"/>
           <w:sz w:val="26"/>
         </w:rPr>
-        <w:t>Lưu tệp, quay lại terminal rồi chạy:</w:t>
-      </w:r>
-    </w:p>
-    <w:p>
-      <w:pPr>
-        <w:widowControl/>
-        <w:spacing w:after="120" w:before="0" w:line="240" w:lineRule="auto"/>
-        <w:ind w:firstLine="0" w:left="142" w:right="85"/>
-        <w:jc w:val="left"/>
-      </w:pPr>
-      <w:r>
-        <w:rPr>
-          <w:rFonts w:ascii="Times New Roman" w:hAnsi="Times New Roman"/>
-          <w:b w:val="0"/>
-          <w:sz w:val="26"/>
-        </w:rPr>
-        <w:t>bash scripts/check-env.sh</w:t>
-      </w:r>
-    </w:p>
-    <w:p>
-      <w:pPr>
-        <w:widowControl/>
-      </w:pPr>
-      <w:r>
-        <w:rPr>
-          <w:rFonts w:ascii="Times New Roman" w:hAnsi="Times New Roman"/>
-          <w:b w:val="0"/>
-          <w:color w:val="000000"/>
-          <w:sz w:val="26"/>
-        </w:rPr>
-        <w:t>Kết quả:</w:t>
+        <w:t xml:space="preserve">Chạy </w:t>
       </w:r>
       <w:r>
         <w:rPr>
@@ -1591,7 +1861,7 @@
           <w:color w:val="000000"/>
           <w:sz w:val="26"/>
         </w:rPr>
-        <w:t xml:space="preserve"> </w:t>
+        <w:t>php thu-ham.php</w:t>
       </w:r>
       <w:r>
         <w:rPr>
@@ -1600,7 +1870,34 @@
           <w:color w:val="000000"/>
           <w:sz w:val="26"/>
         </w:rPr>
-        <w:t>Kiểm tra dự án: CommunityPass</w:t>
+        <w:t xml:space="preserve">. Kết quả gồm </w:t>
+      </w:r>
+      <w:r>
+        <w:rPr>
+          <w:rFonts w:ascii="Times New Roman" w:hAnsi="Times New Roman"/>
+          <w:b w:val="0"/>
+          <w:color w:val="000000"/>
+          <w:sz w:val="26"/>
+        </w:rPr>
+        <w:t>bool(true)</w:t>
+      </w:r>
+      <w:r>
+        <w:rPr>
+          <w:rFonts w:ascii="Times New Roman" w:hAnsi="Times New Roman"/>
+          <w:b w:val="0"/>
+          <w:color w:val="000000"/>
+          <w:sz w:val="26"/>
+        </w:rPr>
+        <w:t xml:space="preserve"> và </w:t>
+      </w:r>
+      <w:r>
+        <w:rPr>
+          <w:rFonts w:ascii="Times New Roman" w:hAnsi="Times New Roman"/>
+          <w:b w:val="0"/>
+          <w:color w:val="000000"/>
+          <w:sz w:val="26"/>
+        </w:rPr>
+        <w:t>bool(false)</w:t>
       </w:r>
       <w:r>
         <w:rPr>
@@ -1623,7 +1920,7 @@
           <w:color w:val="000000"/>
           <w:sz w:val="26"/>
         </w:rPr>
-        <w:t xml:space="preserve">Dòng đầu chỉ định Bash; </w:t>
+        <w:t>int</w:t>
       </w:r>
       <w:r>
         <w:rPr>
@@ -1632,7 +1929,7 @@
           <w:color w:val="000000"/>
           <w:sz w:val="26"/>
         </w:rPr>
-        <w:t>project_name</w:t>
+        <w:t xml:space="preserve"> chỉ tham số số nguyên; </w:t>
       </w:r>
       <w:r>
         <w:rPr>
@@ -1641,7 +1938,7 @@
           <w:color w:val="000000"/>
           <w:sz w:val="26"/>
         </w:rPr>
-        <w:t xml:space="preserve"> là biến; dấu </w:t>
+        <w:t>bool</w:t>
       </w:r>
       <w:r>
         <w:rPr>
@@ -1650,7 +1947,7 @@
           <w:color w:val="000000"/>
           <w:sz w:val="26"/>
         </w:rPr>
-        <w:t>$</w:t>
+        <w:t xml:space="preserve"> chỉ kết quả đúng/sai; </w:t>
       </w:r>
       <w:r>
         <w:rPr>
@@ -1659,7 +1956,7 @@
           <w:color w:val="000000"/>
           <w:sz w:val="26"/>
         </w:rPr>
-        <w:t xml:space="preserve"> lấy giá trị biến; </w:t>
+        <w:t>||</w:t>
       </w:r>
       <w:r>
         <w:rPr>
@@ -1668,7 +1965,7 @@
           <w:color w:val="000000"/>
           <w:sz w:val="26"/>
         </w:rPr>
-        <w:t>echo</w:t>
+        <w:t xml:space="preserve"> nghĩa là hoặc. </w:t>
       </w:r>
       <w:r>
         <w:rPr>
@@ -1677,7 +1974,7 @@
           <w:color w:val="000000"/>
           <w:sz w:val="26"/>
         </w:rPr>
-        <w:t xml:space="preserve"> in thông báo. Khi gán biến không đặt khoảng trắng quanh dấu </w:t>
+        <w:t>return</w:t>
       </w:r>
       <w:r>
         <w:rPr>
@@ -1686,70 +1983,7 @@
           <w:color w:val="000000"/>
           <w:sz w:val="26"/>
         </w:rPr>
-        <w:t>=</w:t>
-      </w:r>
-      <w:r>
-        <w:rPr>
-          <w:rFonts w:ascii="Times New Roman" w:hAnsi="Times New Roman"/>
-          <w:b w:val="0"/>
-          <w:color w:val="000000"/>
-          <w:sz w:val="26"/>
-        </w:rPr>
-        <w:t xml:space="preserve">. Khi gọi qua </w:t>
-      </w:r>
-      <w:r>
-        <w:rPr>
-          <w:rFonts w:ascii="Times New Roman" w:hAnsi="Times New Roman"/>
-          <w:b w:val="0"/>
-          <w:color w:val="000000"/>
-          <w:sz w:val="26"/>
-        </w:rPr>
-        <w:t>bash ...</w:t>
-      </w:r>
-      <w:r>
-        <w:rPr>
-          <w:rFonts w:ascii="Times New Roman" w:hAnsi="Times New Roman"/>
-          <w:b w:val="0"/>
-          <w:color w:val="000000"/>
-          <w:sz w:val="26"/>
-        </w:rPr>
-        <w:t xml:space="preserve">, chưa cần cấp quyền thực thi. Sau này có thể dùng </w:t>
-      </w:r>
-      <w:r>
-        <w:rPr>
-          <w:rFonts w:ascii="Times New Roman" w:hAnsi="Times New Roman"/>
-          <w:b w:val="0"/>
-          <w:color w:val="000000"/>
-          <w:sz w:val="26"/>
-        </w:rPr>
-        <w:t>chmod +x scripts/check-env.sh</w:t>
-      </w:r>
-      <w:r>
-        <w:rPr>
-          <w:rFonts w:ascii="Times New Roman" w:hAnsi="Times New Roman"/>
-          <w:b w:val="0"/>
-          <w:color w:val="000000"/>
-          <w:sz w:val="26"/>
-        </w:rPr>
-        <w:t xml:space="preserve"> rồi gọi </w:t>
-      </w:r>
-      <w:r>
-        <w:rPr>
-          <w:rFonts w:ascii="Times New Roman" w:hAnsi="Times New Roman"/>
-          <w:b w:val="0"/>
-          <w:color w:val="000000"/>
-          <w:sz w:val="26"/>
-        </w:rPr>
-        <w:t>./scripts/check-env.sh</w:t>
-      </w:r>
-      <w:r>
-        <w:rPr>
-          <w:rFonts w:ascii="Times New Roman" w:hAnsi="Times New Roman"/>
-          <w:b w:val="0"/>
-          <w:color w:val="000000"/>
-          <w:sz w:val="26"/>
-        </w:rPr>
-        <w:t>.</w:t>
+        <w:t xml:space="preserve"> kết thúc hàm và trả giá trị cho nơi gọi. Hai biến tham số chỉ có ý nghĩa bên trong lần gọi hàm, không đọc dữ liệu từ giao diện.</w:t>
       </w:r>
     </w:p>
     <w:p>
@@ -1788,7 +2022,7 @@
           <w:color w:val="000000"/>
           <w:sz w:val="26"/>
         </w:rPr>
-        <w:t xml:space="preserve"> ] Script in Kiểm tra dự án: CommunityPass; tên biến không có khoảng trắng quanh dấu =.</w:t>
+        <w:t xml:space="preserve"> ] Hàm thử trả true khi 10/9, false khi 10/10 và khi dữ liệu sai.</w:t>
       </w:r>
     </w:p>
     <w:p>
@@ -1804,7 +2038,7 @@
           <w:color w:val="000000"/>
           <w:sz w:val="26"/>
         </w:rPr>
-        <w:t>Bước 3. Thử điều kiện có công cụ PHP</w:t>
+        <w:t>Bước 3. Đưa cùng quy tắc vào một lớp</w:t>
       </w:r>
     </w:p>
     <w:p>
@@ -1819,7 +2053,25 @@
           <w:color w:val="000000"/>
           <w:sz w:val="26"/>
         </w:rPr>
-        <w:t>Thay toàn bộ nội dung tệp bằng đoạn dưới, lưu và chạy lại:</w:t>
+        <w:t xml:space="preserve">Mở </w:t>
+      </w:r>
+      <w:r>
+        <w:rPr>
+          <w:rFonts w:ascii="Times New Roman" w:hAnsi="Times New Roman"/>
+          <w:b w:val="0"/>
+          <w:color w:val="000000"/>
+          <w:sz w:val="26"/>
+        </w:rPr>
+        <w:t>src/CapacityPolicy.php</w:t>
+      </w:r>
+      <w:r>
+        <w:rPr>
+          <w:rFonts w:ascii="Times New Roman" w:hAnsi="Times New Roman"/>
+          <w:b w:val="0"/>
+          <w:color w:val="000000"/>
+          <w:sz w:val="26"/>
+        </w:rPr>
+        <w:t xml:space="preserve"> và nhập toàn bộ nội dung sau:</w:t>
       </w:r>
     </w:p>
     <w:p>
@@ -1837,7 +2089,41 @@
           <w:b w:val="0"/>
           <w:sz w:val="26"/>
         </w:rPr>
-        <w:t>#!/usr/bin/env bash</w:t>
+        <w:t>&lt;?php</w:t>
+      </w:r>
+    </w:p>
+    <w:p>
+      <w:pPr>
+        <w:keepNext w:val="0"/>
+        <w:keepLines/>
+        <w:widowControl/>
+        <w:spacing w:after="0" w:before="0" w:line="240" w:lineRule="auto"/>
+        <w:ind w:firstLine="0" w:left="142" w:right="85"/>
+        <w:jc w:val="left"/>
+      </w:pPr>
+      <w:r>
+        <w:rPr>
+          <w:rFonts w:ascii="Times New Roman" w:hAnsi="Times New Roman"/>
+          <w:b w:val="0"/>
+          <w:sz w:val="26"/>
+        </w:rPr>
+        <w:t>declare(strict_types=1);</w:t>
+      </w:r>
+    </w:p>
+    <w:p>
+      <w:pPr>
+        <w:widowControl/>
+        <w:spacing w:after="0" w:before="0" w:line="240" w:lineRule="auto"/>
+        <w:ind w:firstLine="0" w:left="142" w:right="85"/>
+        <w:jc w:val="left"/>
+      </w:pPr>
+      <w:r>
+        <w:rPr>
+          <w:rFonts w:ascii="Times New Roman" w:hAnsi="Times New Roman"/>
+          <w:b w:val="0"/>
+          <w:sz w:val="26"/>
+        </w:rPr>
+        <w:t xml:space="preserve"> </w:t>
       </w:r>
     </w:p>
     <w:p>
@@ -1855,7 +2141,7 @@
           <w:b w:val="0"/>
           <w:sz w:val="26"/>
         </w:rPr>
-        <w:t>if command -v php &gt;/dev/null 2&gt;&amp;1; then</w:t>
+        <w:t>final class CapacityPolicy</w:t>
       </w:r>
     </w:p>
     <w:p>
@@ -1873,7 +2159,7 @@
           <w:b w:val="0"/>
           <w:sz w:val="26"/>
         </w:rPr>
-        <w:t xml:space="preserve">    echo "OK tool php"</w:t>
+        <w:t>{</w:t>
       </w:r>
     </w:p>
     <w:p>
@@ -1891,7 +2177,7 @@
           <w:b w:val="0"/>
           <w:sz w:val="26"/>
         </w:rPr>
-        <w:t>else</w:t>
+        <w:t xml:space="preserve">    public function canRegister(int $capacity, int $registered): bool</w:t>
       </w:r>
     </w:p>
     <w:p>
@@ -1909,7 +2195,79 @@
           <w:b w:val="0"/>
           <w:sz w:val="26"/>
         </w:rPr>
-        <w:t xml:space="preserve">    echo "MISSING tool php"</w:t>
+        <w:t xml:space="preserve">    {</w:t>
+      </w:r>
+    </w:p>
+    <w:p>
+      <w:pPr>
+        <w:keepNext/>
+        <w:keepLines/>
+        <w:widowControl/>
+        <w:spacing w:after="0" w:before="0" w:line="240" w:lineRule="auto"/>
+        <w:ind w:firstLine="0" w:left="142" w:right="85"/>
+        <w:jc w:val="left"/>
+      </w:pPr>
+      <w:r>
+        <w:rPr>
+          <w:rFonts w:ascii="Times New Roman" w:hAnsi="Times New Roman"/>
+          <w:b w:val="0"/>
+          <w:sz w:val="26"/>
+        </w:rPr>
+        <w:t xml:space="preserve">        if ($capacity &lt;= 0 || $registered &lt; 0) {</w:t>
+      </w:r>
+    </w:p>
+    <w:p>
+      <w:pPr>
+        <w:keepNext/>
+        <w:keepLines/>
+        <w:widowControl/>
+        <w:spacing w:after="0" w:before="0" w:line="240" w:lineRule="auto"/>
+        <w:ind w:firstLine="0" w:left="142" w:right="85"/>
+        <w:jc w:val="left"/>
+      </w:pPr>
+      <w:r>
+        <w:rPr>
+          <w:rFonts w:ascii="Times New Roman" w:hAnsi="Times New Roman"/>
+          <w:b w:val="0"/>
+          <w:sz w:val="26"/>
+        </w:rPr>
+        <w:t xml:space="preserve">            return false;</w:t>
+      </w:r>
+    </w:p>
+    <w:p>
+      <w:pPr>
+        <w:keepNext/>
+        <w:keepLines/>
+        <w:widowControl/>
+        <w:spacing w:after="0" w:before="0" w:line="240" w:lineRule="auto"/>
+        <w:ind w:firstLine="0" w:left="142" w:right="85"/>
+        <w:jc w:val="left"/>
+      </w:pPr>
+      <w:r>
+        <w:rPr>
+          <w:rFonts w:ascii="Times New Roman" w:hAnsi="Times New Roman"/>
+          <w:b w:val="0"/>
+          <w:sz w:val="26"/>
+        </w:rPr>
+        <w:t xml:space="preserve">        }</w:t>
+      </w:r>
+    </w:p>
+    <w:p>
+      <w:pPr>
+        <w:keepNext/>
+        <w:keepLines/>
+        <w:widowControl/>
+        <w:spacing w:after="0" w:before="0" w:line="240" w:lineRule="auto"/>
+        <w:ind w:firstLine="0" w:left="142" w:right="85"/>
+        <w:jc w:val="left"/>
+      </w:pPr>
+      <w:r>
+        <w:rPr>
+          <w:rFonts w:ascii="Times New Roman" w:hAnsi="Times New Roman"/>
+          <w:b w:val="0"/>
+          <w:sz w:val="26"/>
+        </w:rPr>
+        <w:t xml:space="preserve">        return $registered &lt; $capacity;</w:t>
       </w:r>
     </w:p>
     <w:p>
@@ -1927,7 +2285,7 @@
           <w:b w:val="0"/>
           <w:sz w:val="26"/>
         </w:rPr>
-        <w:t xml:space="preserve">    exit 2</w:t>
+        <w:t xml:space="preserve">    }</w:t>
       </w:r>
     </w:p>
     <w:p>
@@ -1943,7 +2301,7 @@
           <w:b w:val="0"/>
           <w:sz w:val="26"/>
         </w:rPr>
-        <w:t>fi</w:t>
+        <w:t>}</w:t>
       </w:r>
     </w:p>
     <w:p>
@@ -1957,213 +2315,7 @@
           <w:color w:val="000000"/>
           <w:sz w:val="26"/>
         </w:rPr>
-        <w:t>if</w:t>
-      </w:r>
-      <w:r>
-        <w:rPr>
-          <w:rFonts w:ascii="Times New Roman" w:hAnsi="Times New Roman"/>
-          <w:b w:val="0"/>
-          <w:color w:val="000000"/>
-          <w:sz w:val="26"/>
-        </w:rPr>
-        <w:t xml:space="preserve"> xem lệnh kiểm tra có thành công hay không; </w:t>
-      </w:r>
-      <w:r>
-        <w:rPr>
-          <w:rFonts w:ascii="Times New Roman" w:hAnsi="Times New Roman"/>
-          <w:b w:val="0"/>
-          <w:color w:val="000000"/>
-          <w:sz w:val="26"/>
-        </w:rPr>
-        <w:t>then</w:t>
-      </w:r>
-      <w:r>
-        <w:rPr>
-          <w:rFonts w:ascii="Times New Roman" w:hAnsi="Times New Roman"/>
-          <w:b w:val="0"/>
-          <w:color w:val="000000"/>
-          <w:sz w:val="26"/>
-        </w:rPr>
-        <w:t xml:space="preserve"> là nhánh đạt; </w:t>
-      </w:r>
-      <w:r>
-        <w:rPr>
-          <w:rFonts w:ascii="Times New Roman" w:hAnsi="Times New Roman"/>
-          <w:b w:val="0"/>
-          <w:color w:val="000000"/>
-          <w:sz w:val="26"/>
-        </w:rPr>
-        <w:t>else</w:t>
-      </w:r>
-      <w:r>
-        <w:rPr>
-          <w:rFonts w:ascii="Times New Roman" w:hAnsi="Times New Roman"/>
-          <w:b w:val="0"/>
-          <w:color w:val="000000"/>
-          <w:sz w:val="26"/>
-        </w:rPr>
-        <w:t xml:space="preserve"> là nhánh thiếu; </w:t>
-      </w:r>
-      <w:r>
-        <w:rPr>
-          <w:rFonts w:ascii="Times New Roman" w:hAnsi="Times New Roman"/>
-          <w:b w:val="0"/>
-          <w:color w:val="000000"/>
-          <w:sz w:val="26"/>
-        </w:rPr>
-        <w:t>fi</w:t>
-      </w:r>
-      <w:r>
-        <w:rPr>
-          <w:rFonts w:ascii="Times New Roman" w:hAnsi="Times New Roman"/>
-          <w:b w:val="0"/>
-          <w:color w:val="000000"/>
-          <w:sz w:val="26"/>
-        </w:rPr>
-        <w:t xml:space="preserve"> kết thúc điều kiện. Cụm </w:t>
-      </w:r>
-      <w:r>
-        <w:rPr>
-          <w:rFonts w:ascii="Times New Roman" w:hAnsi="Times New Roman"/>
-          <w:b w:val="0"/>
-          <w:color w:val="000000"/>
-          <w:sz w:val="26"/>
-        </w:rPr>
-        <w:t>&gt;/dev/null 2&gt;&amp;1</w:t>
-      </w:r>
-      <w:r>
-        <w:rPr>
-          <w:rFonts w:ascii="Times New Roman" w:hAnsi="Times New Roman"/>
-          <w:b w:val="0"/>
-          <w:color w:val="000000"/>
-          <w:sz w:val="26"/>
-        </w:rPr>
-        <w:t xml:space="preserve"> chỉ ẩn phần thông báo của lệnh kiểm tra để kết quả gọn; không biến lỗi thành thành công.</w:t>
-      </w:r>
-    </w:p>
-    <w:p>
-      <w:pPr>
-        <w:widowControl/>
-      </w:pPr>
-      <w:r>
-        <w:rPr>
-          <w:rFonts w:ascii="Times New Roman" w:hAnsi="Times New Roman"/>
-          <w:b w:val="0"/>
-          <w:color w:val="000000"/>
-          <w:sz w:val="26"/>
-        </w:rPr>
-        <w:t xml:space="preserve">Không gỡ PHP khỏi máy để thử nhánh thiếu. Có thể tạm thay tên kiểm tra </w:t>
-      </w:r>
-      <w:r>
-        <w:rPr>
-          <w:rFonts w:ascii="Times New Roman" w:hAnsi="Times New Roman"/>
-          <w:b w:val="0"/>
-          <w:color w:val="000000"/>
-          <w:sz w:val="26"/>
-        </w:rPr>
-        <w:t>php</w:t>
-      </w:r>
-      <w:r>
-        <w:rPr>
-          <w:rFonts w:ascii="Times New Roman" w:hAnsi="Times New Roman"/>
-          <w:b w:val="0"/>
-          <w:color w:val="000000"/>
-          <w:sz w:val="26"/>
-        </w:rPr>
-        <w:t xml:space="preserve"> thành </w:t>
-      </w:r>
-      <w:r>
-        <w:rPr>
-          <w:rFonts w:ascii="Times New Roman" w:hAnsi="Times New Roman"/>
-          <w:b w:val="0"/>
-          <w:color w:val="000000"/>
-          <w:sz w:val="26"/>
-        </w:rPr>
-        <w:t>cong_cu_khong_co</w:t>
-      </w:r>
-      <w:r>
-        <w:rPr>
-          <w:rFonts w:ascii="Times New Roman" w:hAnsi="Times New Roman"/>
-          <w:b w:val="0"/>
-          <w:color w:val="000000"/>
-          <w:sz w:val="26"/>
-        </w:rPr>
-        <w:t>, chạy để quan sát rồi đổi lại. Sau một lần chạy, gõ ngay:</w:t>
-      </w:r>
-    </w:p>
-    <w:p>
-      <w:pPr>
-        <w:widowControl/>
-        <w:spacing w:after="120" w:before="0" w:line="240" w:lineRule="auto"/>
-        <w:ind w:firstLine="0" w:left="142" w:right="85"/>
-        <w:jc w:val="left"/>
-      </w:pPr>
-      <w:r>
-        <w:rPr>
-          <w:rFonts w:ascii="Times New Roman" w:hAnsi="Times New Roman"/>
-          <w:b w:val="0"/>
-          <w:sz w:val="26"/>
-        </w:rPr>
-        <w:t>echo "exit=$?"</w:t>
-      </w:r>
-    </w:p>
-    <w:p>
-      <w:pPr>
-        <w:widowControl/>
-      </w:pPr>
-      <w:r>
-        <w:rPr>
-          <w:rFonts w:ascii="Times New Roman" w:hAnsi="Times New Roman"/>
-          <w:b w:val="0"/>
-          <w:color w:val="000000"/>
-          <w:sz w:val="26"/>
-        </w:rPr>
-        <w:t>$?</w:t>
-      </w:r>
-      <w:r>
-        <w:rPr>
-          <w:rFonts w:ascii="Times New Roman" w:hAnsi="Times New Roman"/>
-          <w:b w:val="0"/>
-          <w:color w:val="000000"/>
-          <w:sz w:val="26"/>
-        </w:rPr>
-        <w:t xml:space="preserve"> chứa mã thoát của lệnh vừa chạy. Mã </w:t>
-      </w:r>
-      <w:r>
-        <w:rPr>
-          <w:rFonts w:ascii="Times New Roman" w:hAnsi="Times New Roman"/>
-          <w:b w:val="0"/>
-          <w:color w:val="000000"/>
-          <w:sz w:val="26"/>
-        </w:rPr>
-        <w:t>0</w:t>
-      </w:r>
-      <w:r>
-        <w:rPr>
-          <w:rFonts w:ascii="Times New Roman" w:hAnsi="Times New Roman"/>
-          <w:b w:val="0"/>
-          <w:color w:val="000000"/>
-          <w:sz w:val="26"/>
-        </w:rPr>
-        <w:t xml:space="preserve"> nghĩa là thành công; mẫu này quy ước </w:t>
-      </w:r>
-      <w:r>
-        <w:rPr>
-          <w:rFonts w:ascii="Times New Roman" w:hAnsi="Times New Roman"/>
-          <w:b w:val="0"/>
-          <w:color w:val="000000"/>
-          <w:sz w:val="26"/>
-        </w:rPr>
-        <w:t>2</w:t>
-      </w:r>
-      <w:r>
-        <w:rPr>
-          <w:rFonts w:ascii="Times New Roman" w:hAnsi="Times New Roman"/>
-          <w:b w:val="0"/>
-          <w:color w:val="000000"/>
-          <w:sz w:val="26"/>
-        </w:rPr>
-        <w:t xml:space="preserve"> là thiếu điều kiện chuẩn bị. Phải đọc mã ngay sau lệnh cần kiểm tra, trước khi chạy lệnh khác.</w:t>
+        <w:t>Lớp là nơi nhóm các phương thức liên quan; trong bài này chỉ cần một phương thức canRegister. public cho phép gọi phương thức từ nơi khác. final không cho lớp khác kế thừa lớp này; bài không yêu cầu thiết kế kế thừa. declare(strict_types=1) bật kiểm tra kiểu nghiêm ngặt cho các lời gọi có kiểu trong tệp; dữ liệu form dạng chuỗi khi nhận dữ liệu Form vẫn phải được kiểm tra và chuyển đổi trước khi sử dụng.</w:t>
       </w:r>
     </w:p>
     <w:p>
@@ -2202,7 +2354,7 @@
           <w:color w:val="000000"/>
           <w:sz w:val="26"/>
         </w:rPr>
-        <w:t xml:space="preserve"> ] Thử tên công cụ không tồn tại thấy nhánh MISSING và mã 2, rồi khôi phục php.</w:t>
+        <w:t xml:space="preserve"> ] Lớp CapacityPolicy chỉ xử lý quy tắc, chưa cần HTML hoặc database.</w:t>
       </w:r>
     </w:p>
     <w:p>
@@ -2218,7 +2370,7 @@
           <w:color w:val="000000"/>
           <w:sz w:val="26"/>
         </w:rPr>
-        <w:t>Bước 4. Hoàn thiện script dùng hàm và vòng lặp</w:t>
+        <w:t>Bước 4. Tạo chương trình sử dụng lớp</w:t>
       </w:r>
     </w:p>
     <w:p>
@@ -2233,7 +2385,7 @@
           <w:color w:val="000000"/>
           <w:sz w:val="26"/>
         </w:rPr>
-        <w:t xml:space="preserve">Thay toàn bộ </w:t>
+        <w:t xml:space="preserve">Mở </w:t>
       </w:r>
       <w:r>
         <w:rPr>
@@ -2242,7 +2394,7 @@
           <w:color w:val="000000"/>
           <w:sz w:val="26"/>
         </w:rPr>
-        <w:t>scripts/check-env.sh</w:t>
+        <w:t>demo.php</w:t>
       </w:r>
       <w:r>
         <w:rPr>
@@ -2251,7 +2403,7 @@
           <w:color w:val="000000"/>
           <w:sz w:val="26"/>
         </w:rPr>
-        <w:t xml:space="preserve"> bằng phiên bản hoàn chỉnh sau. Đây là mã mẫu được phép sử dụng trong phần hướng dẫn:</w:t>
+        <w:t xml:space="preserve"> ở gốc bài làm:</w:t>
       </w:r>
     </w:p>
     <w:p>
@@ -2269,7 +2421,41 @@
           <w:b w:val="0"/>
           <w:sz w:val="26"/>
         </w:rPr>
-        <w:t>#!/usr/bin/env bash</w:t>
+        <w:t>&lt;?php</w:t>
+      </w:r>
+    </w:p>
+    <w:p>
+      <w:pPr>
+        <w:keepNext w:val="0"/>
+        <w:keepLines/>
+        <w:widowControl/>
+        <w:spacing w:after="0" w:before="0" w:line="240" w:lineRule="auto"/>
+        <w:ind w:firstLine="0" w:left="142" w:right="85"/>
+        <w:jc w:val="left"/>
+      </w:pPr>
+      <w:r>
+        <w:rPr>
+          <w:rFonts w:ascii="Times New Roman" w:hAnsi="Times New Roman"/>
+          <w:b w:val="0"/>
+          <w:sz w:val="26"/>
+        </w:rPr>
+        <w:t>require __DIR__ . '/src/CapacityPolicy.php';</w:t>
+      </w:r>
+    </w:p>
+    <w:p>
+      <w:pPr>
+        <w:widowControl/>
+        <w:spacing w:after="0" w:before="0" w:line="240" w:lineRule="auto"/>
+        <w:ind w:firstLine="0" w:left="142" w:right="85"/>
+        <w:jc w:val="left"/>
+      </w:pPr>
+      <w:r>
+        <w:rPr>
+          <w:rFonts w:ascii="Times New Roman" w:hAnsi="Times New Roman"/>
+          <w:b w:val="0"/>
+          <w:sz w:val="26"/>
+        </w:rPr>
+        <w:t xml:space="preserve"> </w:t>
       </w:r>
     </w:p>
     <w:p>
@@ -2287,7 +2473,7 @@
           <w:b w:val="0"/>
           <w:sz w:val="26"/>
         </w:rPr>
-        <w:t>set -u</w:t>
+        <w:t>$policy = new CapacityPolicy();</w:t>
       </w:r>
     </w:p>
     <w:p>
@@ -2305,7 +2491,7 @@
           <w:b w:val="0"/>
           <w:sz w:val="26"/>
         </w:rPr>
-        <w:t>root="$(cd -- "$(dirname -- "${BASH_SOURCE[0]}")/.." &amp;&amp; pwd)" || exit 2</w:t>
+        <w:t>$available = $policy-&gt;canRegister(10, 9);</w:t>
       </w:r>
     </w:p>
     <w:p>
@@ -2323,7 +2509,7 @@
           <w:b w:val="0"/>
           <w:sz w:val="26"/>
         </w:rPr>
-        <w:t>fail=0</w:t>
+        <w:t>if ($available) {</w:t>
       </w:r>
     </w:p>
     <w:p>
@@ -2341,7 +2527,7 @@
           <w:b w:val="0"/>
           <w:sz w:val="26"/>
         </w:rPr>
-        <w:t>check_tool() {</w:t>
+        <w:t xml:space="preserve">    echo "AVAILABLE\n";</w:t>
       </w:r>
     </w:p>
     <w:p>
@@ -2359,367 +2545,7 @@
           <w:b w:val="0"/>
           <w:sz w:val="26"/>
         </w:rPr>
-        <w:t xml:space="preserve">  if command -v "$1" &gt;/dev/null 2&gt;&amp;1; then</w:t>
-      </w:r>
-    </w:p>
-    <w:p>
-      <w:pPr>
-        <w:keepNext/>
-        <w:keepLines/>
-        <w:widowControl/>
-        <w:spacing w:after="0" w:before="0" w:line="240" w:lineRule="auto"/>
-        <w:ind w:firstLine="0" w:left="142" w:right="85"/>
-        <w:jc w:val="left"/>
-      </w:pPr>
-      <w:r>
-        <w:rPr>
-          <w:rFonts w:ascii="Times New Roman" w:hAnsi="Times New Roman"/>
-          <w:b w:val="0"/>
-          <w:sz w:val="26"/>
-        </w:rPr>
-        <w:t xml:space="preserve">    printf 'OK tool %s\n' "$1"</w:t>
-      </w:r>
-    </w:p>
-    <w:p>
-      <w:pPr>
-        <w:keepNext/>
-        <w:keepLines/>
-        <w:widowControl/>
-        <w:spacing w:after="0" w:before="0" w:line="240" w:lineRule="auto"/>
-        <w:ind w:firstLine="0" w:left="142" w:right="85"/>
-        <w:jc w:val="left"/>
-      </w:pPr>
-      <w:r>
-        <w:rPr>
-          <w:rFonts w:ascii="Times New Roman" w:hAnsi="Times New Roman"/>
-          <w:b w:val="0"/>
-          <w:sz w:val="26"/>
-        </w:rPr>
-        <w:t xml:space="preserve">  else</w:t>
-      </w:r>
-    </w:p>
-    <w:p>
-      <w:pPr>
-        <w:keepNext/>
-        <w:keepLines/>
-        <w:widowControl/>
-        <w:spacing w:after="0" w:before="0" w:line="240" w:lineRule="auto"/>
-        <w:ind w:firstLine="0" w:left="142" w:right="85"/>
-        <w:jc w:val="left"/>
-      </w:pPr>
-      <w:r>
-        <w:rPr>
-          <w:rFonts w:ascii="Times New Roman" w:hAnsi="Times New Roman"/>
-          <w:b w:val="0"/>
-          <w:sz w:val="26"/>
-        </w:rPr>
-        <w:t xml:space="preserve">    printf 'MISSING tool %s\n' "$1" &gt;&amp;2</w:t>
-      </w:r>
-    </w:p>
-    <w:p>
-      <w:pPr>
-        <w:keepNext/>
-        <w:keepLines/>
-        <w:widowControl/>
-        <w:spacing w:after="0" w:before="0" w:line="240" w:lineRule="auto"/>
-        <w:ind w:firstLine="0" w:left="142" w:right="85"/>
-        <w:jc w:val="left"/>
-      </w:pPr>
-      <w:r>
-        <w:rPr>
-          <w:rFonts w:ascii="Times New Roman" w:hAnsi="Times New Roman"/>
-          <w:b w:val="0"/>
-          <w:sz w:val="26"/>
-        </w:rPr>
-        <w:t xml:space="preserve">    fail=$((fail + 1))</w:t>
-      </w:r>
-    </w:p>
-    <w:p>
-      <w:pPr>
-        <w:keepNext/>
-        <w:keepLines/>
-        <w:widowControl/>
-        <w:spacing w:after="0" w:before="0" w:line="240" w:lineRule="auto"/>
-        <w:ind w:firstLine="0" w:left="142" w:right="85"/>
-        <w:jc w:val="left"/>
-      </w:pPr>
-      <w:r>
-        <w:rPr>
-          <w:rFonts w:ascii="Times New Roman" w:hAnsi="Times New Roman"/>
-          <w:b w:val="0"/>
-          <w:sz w:val="26"/>
-        </w:rPr>
-        <w:t xml:space="preserve">  fi</w:t>
-      </w:r>
-    </w:p>
-    <w:p>
-      <w:pPr>
-        <w:keepNext/>
-        <w:keepLines/>
-        <w:widowControl/>
-        <w:spacing w:after="0" w:before="0" w:line="240" w:lineRule="auto"/>
-        <w:ind w:firstLine="0" w:left="142" w:right="85"/>
-        <w:jc w:val="left"/>
-      </w:pPr>
-      <w:r>
-        <w:rPr>
-          <w:rFonts w:ascii="Times New Roman" w:hAnsi="Times New Roman"/>
-          <w:b w:val="0"/>
-          <w:sz w:val="26"/>
-        </w:rPr>
-        <w:t>}</w:t>
-      </w:r>
-    </w:p>
-    <w:p>
-      <w:pPr>
-        <w:keepNext/>
-        <w:keepLines/>
-        <w:widowControl/>
-        <w:spacing w:after="0" w:before="0" w:line="240" w:lineRule="auto"/>
-        <w:ind w:firstLine="0" w:left="142" w:right="85"/>
-        <w:jc w:val="left"/>
-      </w:pPr>
-      <w:r>
-        <w:rPr>
-          <w:rFonts w:ascii="Times New Roman" w:hAnsi="Times New Roman"/>
-          <w:b w:val="0"/>
-          <w:sz w:val="26"/>
-        </w:rPr>
-        <w:t>for tool in php git; do check_tool "$tool"; done</w:t>
-      </w:r>
-    </w:p>
-    <w:p>
-      <w:pPr>
-        <w:keepNext/>
-        <w:keepLines/>
-        <w:widowControl/>
-        <w:spacing w:after="0" w:before="0" w:line="240" w:lineRule="auto"/>
-        <w:ind w:firstLine="0" w:left="142" w:right="85"/>
-        <w:jc w:val="left"/>
-      </w:pPr>
-      <w:r>
-        <w:rPr>
-          <w:rFonts w:ascii="Times New Roman" w:hAnsi="Times New Roman"/>
-          <w:b w:val="0"/>
-          <w:sz w:val="26"/>
-        </w:rPr>
-        <w:t>for file in README.md public/index.php; do</w:t>
-      </w:r>
-    </w:p>
-    <w:p>
-      <w:pPr>
-        <w:keepNext/>
-        <w:keepLines/>
-        <w:widowControl/>
-        <w:spacing w:after="0" w:before="0" w:line="240" w:lineRule="auto"/>
-        <w:ind w:firstLine="0" w:left="142" w:right="85"/>
-        <w:jc w:val="left"/>
-      </w:pPr>
-      <w:r>
-        <w:rPr>
-          <w:rFonts w:ascii="Times New Roman" w:hAnsi="Times New Roman"/>
-          <w:b w:val="0"/>
-          <w:sz w:val="26"/>
-        </w:rPr>
-        <w:t xml:space="preserve">  if [[ -f "$root/$file" ]]; then</w:t>
-      </w:r>
-    </w:p>
-    <w:p>
-      <w:pPr>
-        <w:keepNext/>
-        <w:keepLines/>
-        <w:widowControl/>
-        <w:spacing w:after="0" w:before="0" w:line="240" w:lineRule="auto"/>
-        <w:ind w:firstLine="0" w:left="142" w:right="85"/>
-        <w:jc w:val="left"/>
-      </w:pPr>
-      <w:r>
-        <w:rPr>
-          <w:rFonts w:ascii="Times New Roman" w:hAnsi="Times New Roman"/>
-          <w:b w:val="0"/>
-          <w:sz w:val="26"/>
-        </w:rPr>
-        <w:t xml:space="preserve">    printf 'OK file %s\n' "$file"</w:t>
-      </w:r>
-    </w:p>
-    <w:p>
-      <w:pPr>
-        <w:keepNext/>
-        <w:keepLines/>
-        <w:widowControl/>
-        <w:spacing w:after="0" w:before="0" w:line="240" w:lineRule="auto"/>
-        <w:ind w:firstLine="0" w:left="142" w:right="85"/>
-        <w:jc w:val="left"/>
-      </w:pPr>
-      <w:r>
-        <w:rPr>
-          <w:rFonts w:ascii="Times New Roman" w:hAnsi="Times New Roman"/>
-          <w:b w:val="0"/>
-          <w:sz w:val="26"/>
-        </w:rPr>
-        <w:t xml:space="preserve">  else</w:t>
-      </w:r>
-    </w:p>
-    <w:p>
-      <w:pPr>
-        <w:keepNext/>
-        <w:keepLines/>
-        <w:widowControl/>
-        <w:spacing w:after="0" w:before="0" w:line="240" w:lineRule="auto"/>
-        <w:ind w:firstLine="0" w:left="142" w:right="85"/>
-        <w:jc w:val="left"/>
-      </w:pPr>
-      <w:r>
-        <w:rPr>
-          <w:rFonts w:ascii="Times New Roman" w:hAnsi="Times New Roman"/>
-          <w:b w:val="0"/>
-          <w:sz w:val="26"/>
-        </w:rPr>
-        <w:t xml:space="preserve">    printf 'MISSING file %s\n' "$file" &gt;&amp;2</w:t>
-      </w:r>
-    </w:p>
-    <w:p>
-      <w:pPr>
-        <w:keepNext/>
-        <w:keepLines/>
-        <w:widowControl/>
-        <w:spacing w:after="0" w:before="0" w:line="240" w:lineRule="auto"/>
-        <w:ind w:firstLine="0" w:left="142" w:right="85"/>
-        <w:jc w:val="left"/>
-      </w:pPr>
-      <w:r>
-        <w:rPr>
-          <w:rFonts w:ascii="Times New Roman" w:hAnsi="Times New Roman"/>
-          <w:b w:val="0"/>
-          <w:sz w:val="26"/>
-        </w:rPr>
-        <w:t xml:space="preserve">    fail=$((fail + 1))</w:t>
-      </w:r>
-    </w:p>
-    <w:p>
-      <w:pPr>
-        <w:keepNext/>
-        <w:keepLines/>
-        <w:widowControl/>
-        <w:spacing w:after="0" w:before="0" w:line="240" w:lineRule="auto"/>
-        <w:ind w:firstLine="0" w:left="142" w:right="85"/>
-        <w:jc w:val="left"/>
-      </w:pPr>
-      <w:r>
-        <w:rPr>
-          <w:rFonts w:ascii="Times New Roman" w:hAnsi="Times New Roman"/>
-          <w:b w:val="0"/>
-          <w:sz w:val="26"/>
-        </w:rPr>
-        <w:t xml:space="preserve">  fi</w:t>
-      </w:r>
-    </w:p>
-    <w:p>
-      <w:pPr>
-        <w:keepNext/>
-        <w:keepLines/>
-        <w:widowControl/>
-        <w:spacing w:after="0" w:before="0" w:line="240" w:lineRule="auto"/>
-        <w:ind w:firstLine="0" w:left="142" w:right="85"/>
-        <w:jc w:val="left"/>
-      </w:pPr>
-      <w:r>
-        <w:rPr>
-          <w:rFonts w:ascii="Times New Roman" w:hAnsi="Times New Roman"/>
-          <w:b w:val="0"/>
-          <w:sz w:val="26"/>
-        </w:rPr>
-        <w:t>done</w:t>
-      </w:r>
-    </w:p>
-    <w:p>
-      <w:pPr>
-        <w:keepNext/>
-        <w:keepLines/>
-        <w:widowControl/>
-        <w:spacing w:after="0" w:before="0" w:line="240" w:lineRule="auto"/>
-        <w:ind w:firstLine="0" w:left="142" w:right="85"/>
-        <w:jc w:val="left"/>
-      </w:pPr>
-      <w:r>
-        <w:rPr>
-          <w:rFonts w:ascii="Times New Roman" w:hAnsi="Times New Roman"/>
-          <w:b w:val="0"/>
-          <w:sz w:val="26"/>
-        </w:rPr>
-        <w:t>if [[ "$fail" -gt 0 ]]; then exit 2; fi</w:t>
-      </w:r>
-    </w:p>
-    <w:p>
-      <w:pPr>
-        <w:keepNext/>
-        <w:keepLines/>
-        <w:widowControl/>
-        <w:spacing w:after="0" w:before="0" w:line="240" w:lineRule="auto"/>
-        <w:ind w:firstLine="0" w:left="142" w:right="85"/>
-        <w:jc w:val="left"/>
-      </w:pPr>
-      <w:r>
-        <w:rPr>
-          <w:rFonts w:ascii="Times New Roman" w:hAnsi="Times New Roman"/>
-          <w:b w:val="0"/>
-          <w:sz w:val="26"/>
-        </w:rPr>
-        <w:t>if php -l "$root/public/index.php"; then</w:t>
-      </w:r>
-    </w:p>
-    <w:p>
-      <w:pPr>
-        <w:keepNext/>
-        <w:keepLines/>
-        <w:widowControl/>
-        <w:spacing w:after="0" w:before="0" w:line="240" w:lineRule="auto"/>
-        <w:ind w:firstLine="0" w:left="142" w:right="85"/>
-        <w:jc w:val="left"/>
-      </w:pPr>
-      <w:r>
-        <w:rPr>
-          <w:rFonts w:ascii="Times New Roman" w:hAnsi="Times New Roman"/>
-          <w:b w:val="0"/>
-          <w:sz w:val="26"/>
-        </w:rPr>
-        <w:t xml:space="preserve">  echo 'CHECK_ENV=PASS'</w:t>
-      </w:r>
-    </w:p>
-    <w:p>
-      <w:pPr>
-        <w:keepNext/>
-        <w:keepLines/>
-        <w:widowControl/>
-        <w:spacing w:after="0" w:before="0" w:line="240" w:lineRule="auto"/>
-        <w:ind w:firstLine="0" w:left="142" w:right="85"/>
-        <w:jc w:val="left"/>
-      </w:pPr>
-      <w:r>
-        <w:rPr>
-          <w:rFonts w:ascii="Times New Roman" w:hAnsi="Times New Roman"/>
-          <w:b w:val="0"/>
-          <w:sz w:val="26"/>
-        </w:rPr>
-        <w:t>else</w:t>
-      </w:r>
-    </w:p>
-    <w:p>
-      <w:pPr>
-        <w:keepNext/>
-        <w:keepLines/>
-        <w:widowControl/>
-        <w:spacing w:after="0" w:before="0" w:line="240" w:lineRule="auto"/>
-        <w:ind w:firstLine="0" w:left="142" w:right="85"/>
-        <w:jc w:val="left"/>
-      </w:pPr>
-      <w:r>
-        <w:rPr>
-          <w:rFonts w:ascii="Times New Roman" w:hAnsi="Times New Roman"/>
-          <w:b w:val="0"/>
-          <w:sz w:val="26"/>
-        </w:rPr>
-        <w:t xml:space="preserve">  echo 'CHECK_ENV=FAIL' &gt;&amp;2</w:t>
+        <w:t>} else {</w:t>
       </w:r>
     </w:p>
     <w:p>
@@ -2737,7 +2563,7 @@
           <w:b w:val="0"/>
           <w:sz w:val="26"/>
         </w:rPr>
-        <w:t xml:space="preserve">  exit 1</w:t>
+        <w:t xml:space="preserve">    echo "FULL\n";</w:t>
       </w:r>
     </w:p>
     <w:p>
@@ -2753,12 +2579,11 @@
           <w:b w:val="0"/>
           <w:sz w:val="26"/>
         </w:rPr>
-        <w:t>fi</w:t>
+        <w:t>}</w:t>
       </w:r>
     </w:p>
     <w:p>
       <w:pPr>
-        <w:keepNext/>
         <w:widowControl/>
       </w:pPr>
       <w:r>
@@ -2768,671 +2593,107 @@
           <w:color w:val="000000"/>
           <w:sz w:val="26"/>
         </w:rPr>
-        <w:t>Giải thích theo thứ tự thực thi:</w:t>
+        <w:t>require</w:t>
       </w:r>
-    </w:p>
-    <w:tbl>
-      <w:tblPr>
-        <w:tblW w:type="auto" w:w="0"/>
-        <w:tblLayout w:type="fixed"/>
-        <w:tblLook w:firstColumn="1" w:firstRow="1" w:lastColumn="0" w:lastRow="0" w:noHBand="0" w:noVBand="1" w:val="04A0"/>
-        <w:tblBorders>
-          <w:top w:val="single" w:sz="4" w:color="000000"/>
-          <w:left w:val="single" w:sz="4" w:color="000000"/>
-          <w:bottom w:val="single" w:sz="4" w:color="000000"/>
-          <w:right w:val="single" w:sz="4" w:color="000000"/>
-          <w:insideH w:val="single" w:sz="4" w:color="000000"/>
-          <w:insideV w:val="single" w:sz="4" w:color="000000"/>
-        </w:tblBorders>
-      </w:tblPr>
-      <w:tblGrid>
-        <w:gridCol w:w="1701"/>
-        <w:gridCol w:w="7370"/>
-      </w:tblGrid>
-      <w:tr>
-        <w:trPr>
-          <w:cantSplit/>
-          <w:tblHeader/>
-        </w:trPr>
-        <w:tc>
-          <w:tcPr>
-            <w:tcW w:type="dxa" w:w="1701"/>
-            <w:tcMar>
-              <w:left w:w="75" w:type="dxa"/>
-              <w:right w:w="75" w:type="dxa"/>
-            </w:tcMar>
-          </w:tcPr>
-          <w:p>
-            <w:pPr>
-              <w:widowControl/>
-              <w:spacing w:line="240" w:lineRule="auto" w:after="80" w:before="80"/>
-              <w:ind w:firstLine="0"/>
-              <w:jc w:val="left"/>
-            </w:pPr>
-            <w:r>
-              <w:rPr>
-                <w:rFonts w:ascii="Times New Roman" w:hAnsi="Times New Roman"/>
-                <w:b/>
-                <w:color w:val="000000"/>
-                <w:sz w:val="26"/>
-              </w:rPr>
-              <w:t>Thành phần</w:t>
-            </w:r>
-          </w:p>
-        </w:tc>
-        <w:tc>
-          <w:tcPr>
-            <w:tcW w:type="dxa" w:w="7370"/>
-            <w:tcMar>
-              <w:left w:w="75" w:type="dxa"/>
-              <w:right w:w="75" w:type="dxa"/>
-            </w:tcMar>
-          </w:tcPr>
-          <w:p>
-            <w:pPr>
-              <w:widowControl/>
-              <w:spacing w:line="240" w:lineRule="auto" w:after="80" w:before="80"/>
-              <w:ind w:firstLine="0"/>
-              <w:jc w:val="left"/>
-            </w:pPr>
-            <w:r>
-              <w:rPr>
-                <w:rFonts w:ascii="Times New Roman" w:hAnsi="Times New Roman"/>
-                <w:sz w:val="26"/>
-              </w:rPr>
-              <w:t>Ý nghĩa</w:t>
-            </w:r>
-          </w:p>
-        </w:tc>
-      </w:tr>
-      <w:tr>
-        <w:trPr>
-          <w:cantSplit/>
-        </w:trPr>
-        <w:tc>
-          <w:tcPr>
-            <w:tcW w:type="dxa" w:w="1701"/>
-            <w:tcMar>
-              <w:left w:w="75" w:type="dxa"/>
-              <w:right w:w="75" w:type="dxa"/>
-            </w:tcMar>
-          </w:tcPr>
-          <w:p>
-            <w:pPr>
-              <w:widowControl/>
-              <w:spacing w:line="240" w:lineRule="auto" w:after="80" w:before="80"/>
-              <w:ind w:firstLine="0"/>
-              <w:jc w:val="left"/>
-            </w:pPr>
-            <w:r>
-              <w:rPr>
-                <w:rFonts w:ascii="Times New Roman" w:hAnsi="Times New Roman"/>
-                <w:b w:val="0"/>
-                <w:color w:val="000000"/>
-                <w:sz w:val="26"/>
-              </w:rPr>
-              <w:t>set -u</w:t>
-            </w:r>
-          </w:p>
-        </w:tc>
-        <w:tc>
-          <w:tcPr>
-            <w:tcW w:type="dxa" w:w="7370"/>
-            <w:tcMar>
-              <w:left w:w="75" w:type="dxa"/>
-              <w:right w:w="75" w:type="dxa"/>
-            </w:tcMar>
-          </w:tcPr>
-          <w:p>
-            <w:pPr>
-              <w:widowControl/>
-              <w:spacing w:line="240" w:lineRule="auto" w:after="80" w:before="80"/>
-              <w:ind w:firstLine="0"/>
-              <w:jc w:val="left"/>
-            </w:pPr>
-            <w:r>
-              <w:rPr>
-                <w:rFonts w:ascii="Times New Roman" w:hAnsi="Times New Roman"/>
-                <w:b w:val="0"/>
-                <w:color w:val="000000"/>
-                <w:sz w:val="26"/>
-              </w:rPr>
-              <w:t>Báo khi sử dụng biến chưa được khai báo; giảm nhầm tên biến.</w:t>
-            </w:r>
-          </w:p>
-        </w:tc>
-      </w:tr>
-      <w:tr>
-        <w:trPr>
-          <w:cantSplit/>
-        </w:trPr>
-        <w:tc>
-          <w:tcPr>
-            <w:tcW w:type="dxa" w:w="1701"/>
-            <w:tcMar>
-              <w:left w:w="75" w:type="dxa"/>
-              <w:right w:w="75" w:type="dxa"/>
-            </w:tcMar>
-          </w:tcPr>
-          <w:p>
-            <w:pPr>
-              <w:widowControl/>
-              <w:spacing w:line="240" w:lineRule="auto" w:after="80" w:before="80"/>
-              <w:ind w:firstLine="0"/>
-              <w:jc w:val="left"/>
-            </w:pPr>
-            <w:r>
-              <w:rPr>
-                <w:rFonts w:ascii="Times New Roman" w:hAnsi="Times New Roman"/>
-                <w:b w:val="0"/>
-                <w:color w:val="000000"/>
-                <w:sz w:val="26"/>
-              </w:rPr>
-              <w:t>root=...</w:t>
-            </w:r>
-          </w:p>
-        </w:tc>
-        <w:tc>
-          <w:tcPr>
-            <w:tcW w:type="dxa" w:w="7370"/>
-            <w:tcMar>
-              <w:left w:w="75" w:type="dxa"/>
-              <w:right w:w="75" w:type="dxa"/>
-            </w:tcMar>
-          </w:tcPr>
-          <w:p>
-            <w:pPr>
-              <w:widowControl/>
-              <w:spacing w:line="240" w:lineRule="auto" w:after="80" w:before="80"/>
-              <w:ind w:firstLine="0"/>
-              <w:jc w:val="left"/>
-            </w:pPr>
-            <w:r>
-              <w:rPr>
-                <w:rFonts w:ascii="Times New Roman" w:hAnsi="Times New Roman"/>
-                <w:b w:val="0"/>
-                <w:color w:val="000000"/>
-                <w:sz w:val="26"/>
-              </w:rPr>
-              <w:t xml:space="preserve">Tìm thư mục dự án từ vị trí tệp script. </w:t>
-            </w:r>
-            <w:r>
-              <w:rPr>
-                <w:rFonts w:ascii="Times New Roman" w:hAnsi="Times New Roman"/>
-                <w:b w:val="0"/>
-                <w:color w:val="000000"/>
-                <w:sz w:val="26"/>
-              </w:rPr>
-              <w:t>dirname</w:t>
-            </w:r>
-            <w:r>
-              <w:rPr>
-                <w:rFonts w:ascii="Times New Roman" w:hAnsi="Times New Roman"/>
-                <w:b w:val="0"/>
-                <w:color w:val="000000"/>
-                <w:sz w:val="26"/>
-              </w:rPr>
-              <w:t xml:space="preserve"> lấy thư mục chứa script; </w:t>
-            </w:r>
-            <w:r>
-              <w:rPr>
-                <w:rFonts w:ascii="Times New Roman" w:hAnsi="Times New Roman"/>
-                <w:b w:val="0"/>
-                <w:color w:val="000000"/>
-                <w:sz w:val="26"/>
-              </w:rPr>
-              <w:t>/..</w:t>
-            </w:r>
-            <w:r>
-              <w:rPr>
-                <w:rFonts w:ascii="Times New Roman" w:hAnsi="Times New Roman"/>
-                <w:b w:val="0"/>
-                <w:color w:val="000000"/>
-                <w:sz w:val="26"/>
-              </w:rPr>
-              <w:t xml:space="preserve"> đi lên một cấp; </w:t>
-            </w:r>
-            <w:r>
-              <w:rPr>
-                <w:rFonts w:ascii="Times New Roman" w:hAnsi="Times New Roman"/>
-                <w:b w:val="0"/>
-                <w:color w:val="000000"/>
-                <w:sz w:val="26"/>
-              </w:rPr>
-              <w:t>pwd</w:t>
-            </w:r>
-            <w:r>
-              <w:rPr>
-                <w:rFonts w:ascii="Times New Roman" w:hAnsi="Times New Roman"/>
-                <w:b w:val="0"/>
-                <w:color w:val="000000"/>
-                <w:sz w:val="26"/>
-              </w:rPr>
-              <w:t xml:space="preserve"> lấy đường dẫn đầy đủ. </w:t>
-            </w:r>
-            <w:r>
-              <w:rPr>
-                <w:rFonts w:ascii="Times New Roman" w:hAnsi="Times New Roman"/>
-                <w:b w:val="0"/>
-                <w:color w:val="000000"/>
-                <w:sz w:val="26"/>
-              </w:rPr>
-              <w:t>$(...)</w:t>
-            </w:r>
-            <w:r>
-              <w:rPr>
-                <w:rFonts w:ascii="Times New Roman" w:hAnsi="Times New Roman"/>
-                <w:b w:val="0"/>
-                <w:color w:val="000000"/>
-                <w:sz w:val="26"/>
-              </w:rPr>
-              <w:t xml:space="preserve"> lấy kết quả lệnh làm giá trị biến.</w:t>
-            </w:r>
-          </w:p>
-        </w:tc>
-      </w:tr>
-      <w:tr>
-        <w:trPr>
-          <w:cantSplit/>
-        </w:trPr>
-        <w:tc>
-          <w:tcPr>
-            <w:tcW w:type="dxa" w:w="1701"/>
-            <w:tcMar>
-              <w:left w:w="75" w:type="dxa"/>
-              <w:right w:w="75" w:type="dxa"/>
-            </w:tcMar>
-          </w:tcPr>
-          <w:p>
-            <w:pPr>
-              <w:widowControl/>
-              <w:spacing w:line="240" w:lineRule="auto" w:after="80" w:before="80"/>
-              <w:ind w:firstLine="0"/>
-              <w:jc w:val="left"/>
-            </w:pPr>
-            <w:r>
-              <w:rPr>
-                <w:rFonts w:ascii="Times New Roman" w:hAnsi="Times New Roman"/>
-                <w:b w:val="0"/>
-                <w:color w:val="000000"/>
-                <w:sz w:val="26"/>
-              </w:rPr>
-              <w:t>fail=0</w:t>
-            </w:r>
-          </w:p>
-        </w:tc>
-        <w:tc>
-          <w:tcPr>
-            <w:tcW w:type="dxa" w:w="7370"/>
-            <w:tcMar>
-              <w:left w:w="75" w:type="dxa"/>
-              <w:right w:w="75" w:type="dxa"/>
-            </w:tcMar>
-          </w:tcPr>
-          <w:p>
-            <w:pPr>
-              <w:widowControl/>
-              <w:spacing w:line="240" w:lineRule="auto" w:after="80" w:before="80"/>
-              <w:ind w:firstLine="0"/>
-              <w:jc w:val="left"/>
-            </w:pPr>
-            <w:r>
-              <w:rPr>
-                <w:rFonts w:ascii="Times New Roman" w:hAnsi="Times New Roman"/>
-                <w:b w:val="0"/>
-                <w:color w:val="000000"/>
-                <w:sz w:val="26"/>
-              </w:rPr>
-              <w:t>Biến đếm điều kiện chưa đạt.</w:t>
-            </w:r>
-          </w:p>
-        </w:tc>
-      </w:tr>
-      <w:tr>
-        <w:trPr>
-          <w:cantSplit/>
-        </w:trPr>
-        <w:tc>
-          <w:tcPr>
-            <w:tcW w:type="dxa" w:w="1701"/>
-            <w:tcMar>
-              <w:left w:w="75" w:type="dxa"/>
-              <w:right w:w="75" w:type="dxa"/>
-            </w:tcMar>
-          </w:tcPr>
-          <w:p>
-            <w:pPr>
-              <w:widowControl/>
-              <w:spacing w:line="240" w:lineRule="auto" w:after="80" w:before="80"/>
-              <w:ind w:firstLine="0"/>
-              <w:jc w:val="left"/>
-            </w:pPr>
-            <w:r>
-              <w:rPr>
-                <w:rFonts w:ascii="Times New Roman" w:hAnsi="Times New Roman"/>
-                <w:b w:val="0"/>
-                <w:color w:val="000000"/>
-                <w:sz w:val="26"/>
-              </w:rPr>
-              <w:t>check_tool()</w:t>
-            </w:r>
-          </w:p>
-        </w:tc>
-        <w:tc>
-          <w:tcPr>
-            <w:tcW w:type="dxa" w:w="7370"/>
-            <w:tcMar>
-              <w:left w:w="75" w:type="dxa"/>
-              <w:right w:w="75" w:type="dxa"/>
-            </w:tcMar>
-          </w:tcPr>
-          <w:p>
-            <w:pPr>
-              <w:widowControl/>
-              <w:spacing w:line="240" w:lineRule="auto" w:after="80" w:before="80"/>
-              <w:ind w:firstLine="0"/>
-              <w:jc w:val="left"/>
-            </w:pPr>
-            <w:r>
-              <w:rPr>
-                <w:rFonts w:ascii="Times New Roman" w:hAnsi="Times New Roman"/>
-                <w:b w:val="0"/>
-                <w:color w:val="000000"/>
-                <w:sz w:val="26"/>
-              </w:rPr>
-              <w:t xml:space="preserve">Hàm nhận tên công cụ qua </w:t>
-            </w:r>
-            <w:r>
-              <w:rPr>
-                <w:rFonts w:ascii="Times New Roman" w:hAnsi="Times New Roman"/>
-                <w:b w:val="0"/>
-                <w:color w:val="000000"/>
-                <w:sz w:val="26"/>
-              </w:rPr>
-              <w:t>$1</w:t>
-            </w:r>
-            <w:r>
-              <w:rPr>
-                <w:rFonts w:ascii="Times New Roman" w:hAnsi="Times New Roman"/>
-                <w:b w:val="0"/>
-                <w:color w:val="000000"/>
-                <w:sz w:val="26"/>
-              </w:rPr>
-              <w:t>, kiểm tra và tăng biến đếm nếu thiếu.</w:t>
-            </w:r>
-          </w:p>
-        </w:tc>
-      </w:tr>
-      <w:tr>
-        <w:trPr>
-          <w:cantSplit/>
-        </w:trPr>
-        <w:tc>
-          <w:tcPr>
-            <w:tcW w:type="dxa" w:w="1701"/>
-            <w:tcMar>
-              <w:left w:w="75" w:type="dxa"/>
-              <w:right w:w="75" w:type="dxa"/>
-            </w:tcMar>
-          </w:tcPr>
-          <w:p>
-            <w:pPr>
-              <w:widowControl/>
-              <w:spacing w:line="240" w:lineRule="auto" w:after="80" w:before="80"/>
-              <w:ind w:firstLine="0"/>
-              <w:jc w:val="left"/>
-            </w:pPr>
-            <w:r>
-              <w:rPr>
-                <w:rFonts w:ascii="Times New Roman" w:hAnsi="Times New Roman"/>
-                <w:b w:val="0"/>
-                <w:color w:val="000000"/>
-                <w:sz w:val="26"/>
-              </w:rPr>
-              <w:t>for tool in php git</w:t>
-            </w:r>
-          </w:p>
-        </w:tc>
-        <w:tc>
-          <w:tcPr>
-            <w:tcW w:type="dxa" w:w="7370"/>
-            <w:tcMar>
-              <w:left w:w="75" w:type="dxa"/>
-              <w:right w:w="75" w:type="dxa"/>
-            </w:tcMar>
-          </w:tcPr>
-          <w:p>
-            <w:pPr>
-              <w:widowControl/>
-              <w:spacing w:line="240" w:lineRule="auto" w:after="80" w:before="80"/>
-              <w:ind w:firstLine="0"/>
-              <w:jc w:val="left"/>
-            </w:pPr>
-            <w:r>
-              <w:rPr>
-                <w:rFonts w:ascii="Times New Roman" w:hAnsi="Times New Roman"/>
-                <w:b w:val="0"/>
-                <w:color w:val="000000"/>
-                <w:sz w:val="26"/>
-              </w:rPr>
-              <w:t xml:space="preserve">Gọi cùng hàm cho PHP và Git, không viết lại hai khối </w:t>
-            </w:r>
-            <w:r>
-              <w:rPr>
-                <w:rFonts w:ascii="Times New Roman" w:hAnsi="Times New Roman"/>
-                <w:b w:val="0"/>
-                <w:color w:val="000000"/>
-                <w:sz w:val="26"/>
-              </w:rPr>
-              <w:t>if</w:t>
-            </w:r>
-            <w:r>
-              <w:rPr>
-                <w:rFonts w:ascii="Times New Roman" w:hAnsi="Times New Roman"/>
-                <w:b w:val="0"/>
-                <w:color w:val="000000"/>
-                <w:sz w:val="26"/>
-              </w:rPr>
-              <w:t>.</w:t>
-            </w:r>
-          </w:p>
-        </w:tc>
-      </w:tr>
-      <w:tr>
-        <w:trPr>
-          <w:cantSplit/>
-        </w:trPr>
-        <w:tc>
-          <w:tcPr>
-            <w:tcW w:type="dxa" w:w="1701"/>
-            <w:tcMar>
-              <w:left w:w="75" w:type="dxa"/>
-              <w:right w:w="75" w:type="dxa"/>
-            </w:tcMar>
-          </w:tcPr>
-          <w:p>
-            <w:pPr>
-              <w:widowControl/>
-              <w:spacing w:line="240" w:lineRule="auto" w:after="80" w:before="80"/>
-              <w:ind w:firstLine="0"/>
-              <w:jc w:val="left"/>
-            </w:pPr>
-            <w:r>
-              <w:rPr>
-                <w:rFonts w:ascii="Times New Roman" w:hAnsi="Times New Roman"/>
-                <w:b w:val="0"/>
-                <w:color w:val="000000"/>
-                <w:sz w:val="26"/>
-              </w:rPr>
-              <w:t>[[ -f ... ]]</w:t>
-            </w:r>
-          </w:p>
-        </w:tc>
-        <w:tc>
-          <w:tcPr>
-            <w:tcW w:type="dxa" w:w="7370"/>
-            <w:tcMar>
-              <w:left w:w="75" w:type="dxa"/>
-              <w:right w:w="75" w:type="dxa"/>
-            </w:tcMar>
-          </w:tcPr>
-          <w:p>
-            <w:pPr>
-              <w:widowControl/>
-              <w:spacing w:line="240" w:lineRule="auto" w:after="80" w:before="80"/>
-              <w:ind w:firstLine="0"/>
-              <w:jc w:val="left"/>
-            </w:pPr>
-            <w:r>
-              <w:rPr>
-                <w:rFonts w:ascii="Times New Roman" w:hAnsi="Times New Roman"/>
-                <w:b w:val="0"/>
-                <w:color w:val="000000"/>
-                <w:sz w:val="26"/>
-              </w:rPr>
-              <w:t>Kiểm tra đường dẫn là một tệp có tồn tại.</w:t>
-            </w:r>
-          </w:p>
-        </w:tc>
-      </w:tr>
-      <w:tr>
-        <w:trPr>
-          <w:cantSplit/>
-        </w:trPr>
-        <w:tc>
-          <w:tcPr>
-            <w:tcW w:type="dxa" w:w="1701"/>
-            <w:tcMar>
-              <w:left w:w="75" w:type="dxa"/>
-              <w:right w:w="75" w:type="dxa"/>
-            </w:tcMar>
-          </w:tcPr>
-          <w:p>
-            <w:pPr>
-              <w:widowControl/>
-              <w:spacing w:line="240" w:lineRule="auto" w:after="80" w:before="80"/>
-              <w:ind w:firstLine="0"/>
-              <w:jc w:val="left"/>
-            </w:pPr>
-            <w:r>
-              <w:rPr>
-                <w:rFonts w:ascii="Times New Roman" w:hAnsi="Times New Roman"/>
-                <w:b w:val="0"/>
-                <w:color w:val="000000"/>
-                <w:sz w:val="26"/>
-              </w:rPr>
-              <w:t>fail=$((fail + 1))</w:t>
-            </w:r>
-          </w:p>
-        </w:tc>
-        <w:tc>
-          <w:tcPr>
-            <w:tcW w:type="dxa" w:w="7370"/>
-            <w:tcMar>
-              <w:left w:w="75" w:type="dxa"/>
-              <w:right w:w="75" w:type="dxa"/>
-            </w:tcMar>
-          </w:tcPr>
-          <w:p>
-            <w:pPr>
-              <w:widowControl/>
-              <w:spacing w:line="240" w:lineRule="auto" w:after="80" w:before="80"/>
-              <w:ind w:firstLine="0"/>
-              <w:jc w:val="left"/>
-            </w:pPr>
-            <w:r>
-              <w:rPr>
-                <w:rFonts w:ascii="Times New Roman" w:hAnsi="Times New Roman"/>
-                <w:b w:val="0"/>
-                <w:color w:val="000000"/>
-                <w:sz w:val="26"/>
-              </w:rPr>
-              <w:t>Phép cộng số nguyên trong Bash.</w:t>
-            </w:r>
-          </w:p>
-        </w:tc>
-      </w:tr>
-      <w:tr>
-        <w:trPr>
-          <w:cantSplit/>
-        </w:trPr>
-        <w:tc>
-          <w:tcPr>
-            <w:tcW w:type="dxa" w:w="1701"/>
-            <w:tcMar>
-              <w:left w:w="75" w:type="dxa"/>
-              <w:right w:w="75" w:type="dxa"/>
-            </w:tcMar>
-          </w:tcPr>
-          <w:p>
-            <w:pPr>
-              <w:widowControl/>
-              <w:spacing w:line="240" w:lineRule="auto" w:after="80" w:before="80"/>
-              <w:ind w:firstLine="0"/>
-              <w:jc w:val="left"/>
-            </w:pPr>
-            <w:r>
-              <w:rPr>
-                <w:rFonts w:ascii="Times New Roman" w:hAnsi="Times New Roman"/>
-                <w:b w:val="0"/>
-                <w:color w:val="000000"/>
-                <w:sz w:val="26"/>
-              </w:rPr>
-              <w:t>exit 2</w:t>
-            </w:r>
-            <w:r>
-              <w:rPr>
-                <w:rFonts w:ascii="Times New Roman" w:hAnsi="Times New Roman"/>
-                <w:b w:val="0"/>
-                <w:color w:val="000000"/>
-                <w:sz w:val="26"/>
-              </w:rPr>
-              <w:t xml:space="preserve">, </w:t>
-            </w:r>
-            <w:r>
-              <w:rPr>
-                <w:rFonts w:ascii="Times New Roman" w:hAnsi="Times New Roman"/>
-                <w:b w:val="0"/>
-                <w:color w:val="000000"/>
-                <w:sz w:val="26"/>
-              </w:rPr>
-              <w:t>exit 1</w:t>
-            </w:r>
-          </w:p>
-        </w:tc>
-        <w:tc>
-          <w:tcPr>
-            <w:tcW w:type="dxa" w:w="7370"/>
-            <w:tcMar>
-              <w:left w:w="75" w:type="dxa"/>
-              <w:right w:w="75" w:type="dxa"/>
-            </w:tcMar>
-          </w:tcPr>
-          <w:p>
-            <w:pPr>
-              <w:widowControl/>
-              <w:spacing w:line="240" w:lineRule="auto" w:after="80" w:before="80"/>
-              <w:ind w:firstLine="0"/>
-              <w:jc w:val="left"/>
-            </w:pPr>
-            <w:r>
-              <w:rPr>
-                <w:rFonts w:ascii="Times New Roman" w:hAnsi="Times New Roman"/>
-                <w:b w:val="0"/>
-                <w:color w:val="000000"/>
-                <w:sz w:val="26"/>
-              </w:rPr>
-              <w:t>Mẫu phân biệt thiếu điều kiện chạy và sai cú pháp PHP.</w:t>
-            </w:r>
-          </w:p>
-        </w:tc>
-      </w:tr>
-    </w:tbl>
-    <w:p>
-      <w:pPr>
-        <w:widowControl/>
-        <w:spacing w:after="0"/>
-      </w:pPr>
+      <w:r>
+        <w:rPr>
+          <w:rFonts w:ascii="Times New Roman" w:hAnsi="Times New Roman"/>
+          <w:b w:val="0"/>
+          <w:color w:val="000000"/>
+          <w:sz w:val="26"/>
+        </w:rPr>
+        <w:t xml:space="preserve"> nạp tệp định nghĩa lớp; </w:t>
+      </w:r>
+      <w:r>
+        <w:rPr>
+          <w:rFonts w:ascii="Times New Roman" w:hAnsi="Times New Roman"/>
+          <w:b w:val="0"/>
+          <w:color w:val="000000"/>
+          <w:sz w:val="26"/>
+        </w:rPr>
+        <w:t>__DIR__</w:t>
+      </w:r>
+      <w:r>
+        <w:rPr>
+          <w:rFonts w:ascii="Times New Roman" w:hAnsi="Times New Roman"/>
+          <w:b w:val="0"/>
+          <w:color w:val="000000"/>
+          <w:sz w:val="26"/>
+        </w:rPr>
+        <w:t xml:space="preserve"> là thư mục của chính tệp hiện tại; </w:t>
+      </w:r>
+      <w:r>
+        <w:rPr>
+          <w:rFonts w:ascii="Times New Roman" w:hAnsi="Times New Roman"/>
+          <w:b w:val="0"/>
+          <w:color w:val="000000"/>
+          <w:sz w:val="26"/>
+        </w:rPr>
+        <w:t>new</w:t>
+      </w:r>
+      <w:r>
+        <w:rPr>
+          <w:rFonts w:ascii="Times New Roman" w:hAnsi="Times New Roman"/>
+          <w:b w:val="0"/>
+          <w:color w:val="000000"/>
+          <w:sz w:val="26"/>
+        </w:rPr>
+        <w:t xml:space="preserve"> tạo đối tượng. Dấu </w:t>
+      </w:r>
+      <w:r>
+        <w:rPr>
+          <w:rFonts w:ascii="Times New Roman" w:hAnsi="Times New Roman"/>
+          <w:b w:val="0"/>
+          <w:color w:val="000000"/>
+          <w:sz w:val="26"/>
+        </w:rPr>
+        <w:t>-&gt;</w:t>
+      </w:r>
+      <w:r>
+        <w:rPr>
+          <w:rFonts w:ascii="Times New Roman" w:hAnsi="Times New Roman"/>
+          <w:b w:val="0"/>
+          <w:color w:val="000000"/>
+          <w:sz w:val="26"/>
+        </w:rPr>
+        <w:t xml:space="preserve"> gọi phương thức của đối tượng. Biến </w:t>
+      </w:r>
+      <w:r>
+        <w:rPr>
+          <w:rFonts w:ascii="Times New Roman" w:hAnsi="Times New Roman"/>
+          <w:b w:val="0"/>
+          <w:color w:val="000000"/>
+          <w:sz w:val="26"/>
+        </w:rPr>
+        <w:t>$available</w:t>
+      </w:r>
+      <w:r>
+        <w:rPr>
+          <w:rFonts w:ascii="Times New Roman" w:hAnsi="Times New Roman"/>
+          <w:b w:val="0"/>
+          <w:color w:val="000000"/>
+          <w:sz w:val="26"/>
+        </w:rPr>
+        <w:t xml:space="preserve"> nhận kết quả Boolean, còn việc in chữ nằm ở </w:t>
+      </w:r>
+      <w:r>
+        <w:rPr>
+          <w:rFonts w:ascii="Times New Roman" w:hAnsi="Times New Roman"/>
+          <w:b w:val="0"/>
+          <w:color w:val="000000"/>
+          <w:sz w:val="26"/>
+        </w:rPr>
+        <w:t>demo.php</w:t>
+      </w:r>
+      <w:r>
+        <w:rPr>
+          <w:rFonts w:ascii="Times New Roman" w:hAnsi="Times New Roman"/>
+          <w:b w:val="0"/>
+          <w:color w:val="000000"/>
+          <w:sz w:val="26"/>
+        </w:rPr>
+        <w:t>, không nằm trong lớp nghiệp vụ.</w:t>
+      </w:r>
     </w:p>
     <w:p>
       <w:pPr>
@@ -3442,9 +2703,10 @@
         <w:rPr>
           <w:rFonts w:ascii="Times New Roman" w:hAnsi="Times New Roman"/>
           <w:b w:val="0"/>
+          <w:color w:val="000000"/>
           <w:sz w:val="26"/>
         </w:rPr>
-        <w:t>Dấu nháy kép giúp Bash coi đường dẫn có khoảng trắng là một đối số. Biến root xác định thư mục dự án từ vị trí script, vì vậy có thể chạy script từ thư mục khác.</w:t>
+        <w:t>Đây là ví dụ sử dụng require tối thiểu để tách tệp. Cách dùng nhiều tệp và tổ chức giao diện được học đầy đủ trong phần xử lý Form, không yêu cầu tự viết bộ tự nạp lớp lúc này.</w:t>
       </w:r>
     </w:p>
     <w:p>
@@ -3483,7 +2745,7 @@
           <w:color w:val="000000"/>
           <w:sz w:val="26"/>
         </w:rPr>
-        <w:t xml:space="preserve"> ] Chỉ ra biến fail, hàm check_tool, hai vòng lặp và điều kiện kết thúc.</w:t>
+        <w:t xml:space="preserve"> ] demo.php nạp đúng tệp và gọi canRegister của đối tượng đã tạo.</w:t>
       </w:r>
     </w:p>
     <w:p>
@@ -3499,7 +2761,7 @@
           <w:color w:val="000000"/>
           <w:sz w:val="26"/>
         </w:rPr>
-        <w:t>Bước 5. Chạy script và đọc kết quả</w:t>
+        <w:t>Bước 5. Chạy và thay đầu vào để thấy tác dụng</w:t>
       </w:r>
     </w:p>
     <w:p>
@@ -3517,7 +2779,7 @@
           <w:b w:val="0"/>
           <w:sz w:val="26"/>
         </w:rPr>
-        <w:t>bash scripts/check-env.sh</w:t>
+        <w:t>php -l src/CapacityPolicy.php</w:t>
       </w:r>
     </w:p>
     <w:p>
@@ -3533,7 +2795,7 @@
           <w:b w:val="0"/>
           <w:sz w:val="26"/>
         </w:rPr>
-        <w:t>echo "exit=$?"</w:t>
+        <w:t>php demo.php</w:t>
       </w:r>
     </w:p>
     <w:p>
@@ -3547,7 +2809,7 @@
           <w:color w:val="000000"/>
           <w:sz w:val="26"/>
         </w:rPr>
-        <w:t xml:space="preserve">Kết quả có </w:t>
+        <w:t xml:space="preserve">Lần đầu có </w:t>
       </w:r>
       <w:r>
         <w:rPr>
@@ -3556,7 +2818,7 @@
           <w:color w:val="000000"/>
           <w:sz w:val="26"/>
         </w:rPr>
-        <w:t>OK tool php</w:t>
+        <w:t>AVAILABLE</w:t>
       </w:r>
       <w:r>
         <w:rPr>
@@ -3565,7 +2827,7 @@
           <w:color w:val="000000"/>
           <w:sz w:val="26"/>
         </w:rPr>
-        <w:t xml:space="preserve">, </w:t>
+        <w:t xml:space="preserve">. Sửa duy nhất lời gọi thành </w:t>
       </w:r>
       <w:r>
         <w:rPr>
@@ -3574,7 +2836,7 @@
           <w:color w:val="000000"/>
           <w:sz w:val="26"/>
         </w:rPr>
-        <w:t>OK tool git</w:t>
+        <w:t>canRegister(10, 10)</w:t>
       </w:r>
       <w:r>
         <w:rPr>
@@ -3583,7 +2845,7 @@
           <w:color w:val="000000"/>
           <w:sz w:val="26"/>
         </w:rPr>
-        <w:t xml:space="preserve">, </w:t>
+        <w:t xml:space="preserve">, lưu </w:t>
       </w:r>
       <w:r>
         <w:rPr>
@@ -3592,7 +2854,7 @@
           <w:color w:val="000000"/>
           <w:sz w:val="26"/>
         </w:rPr>
-        <w:t>OK file README.md</w:t>
+        <w:t>demo.php</w:t>
       </w:r>
       <w:r>
         <w:rPr>
@@ -3601,7 +2863,7 @@
           <w:color w:val="000000"/>
           <w:sz w:val="26"/>
         </w:rPr>
-        <w:t xml:space="preserve">, </w:t>
+        <w:t xml:space="preserve">, chạy lại: có </w:t>
       </w:r>
       <w:r>
         <w:rPr>
@@ -3610,7 +2872,7 @@
           <w:color w:val="000000"/>
           <w:sz w:val="26"/>
         </w:rPr>
-        <w:t>OK file public/index.php</w:t>
+        <w:t>FULL</w:t>
       </w:r>
       <w:r>
         <w:rPr>
@@ -3619,7 +2881,7 @@
           <w:color w:val="000000"/>
           <w:sz w:val="26"/>
         </w:rPr>
-        <w:t xml:space="preserve">, </w:t>
+        <w:t xml:space="preserve">. Sửa về </w:t>
       </w:r>
       <w:r>
         <w:rPr>
@@ -3628,7 +2890,7 @@
           <w:color w:val="000000"/>
           <w:sz w:val="26"/>
         </w:rPr>
-        <w:t>CHECK_ENV=PASS</w:t>
+        <w:t>10,9</w:t>
       </w:r>
       <w:r>
         <w:rPr>
@@ -3637,92 +2899,7 @@
           <w:color w:val="000000"/>
           <w:sz w:val="26"/>
         </w:rPr>
-        <w:t xml:space="preserve"> và cuối cùng </w:t>
-      </w:r>
-      <w:r>
-        <w:rPr>
-          <w:rFonts w:ascii="Times New Roman" w:hAnsi="Times New Roman"/>
-          <w:b w:val="0"/>
-          <w:color w:val="000000"/>
-          <w:sz w:val="26"/>
-        </w:rPr>
-        <w:t>exit=0</w:t>
-      </w:r>
-      <w:r>
-        <w:rPr>
-          <w:rFonts w:ascii="Times New Roman" w:hAnsi="Times New Roman"/>
-          <w:b w:val="0"/>
-          <w:color w:val="000000"/>
-          <w:sz w:val="26"/>
-        </w:rPr>
-        <w:t>. Thông báo cú pháp PHP có đường dẫn riêng của máy bạn.</w:t>
-      </w:r>
-    </w:p>
-    <w:p>
-      <w:pPr>
-        <w:keepNext/>
-        <w:widowControl/>
-      </w:pPr>
-      <w:r>
-        <w:rPr>
-          <w:rFonts w:ascii="Times New Roman" w:hAnsi="Times New Roman"/>
-          <w:b w:val="0"/>
-          <w:color w:val="000000"/>
-          <w:sz w:val="26"/>
-        </w:rPr>
-        <w:t>Thử chạy từ thư mục khác:</w:t>
-      </w:r>
-    </w:p>
-    <w:p>
-      <w:pPr>
-        <w:keepNext/>
-        <w:keepLines/>
-        <w:widowControl/>
-        <w:spacing w:after="0" w:before="0" w:line="240" w:lineRule="auto"/>
-        <w:ind w:firstLine="0" w:left="142" w:right="85"/>
-        <w:jc w:val="left"/>
-      </w:pPr>
-      <w:r>
-        <w:rPr>
-          <w:rFonts w:ascii="Times New Roman" w:hAnsi="Times New Roman"/>
-          <w:b w:val="0"/>
-          <w:sz w:val="26"/>
-        </w:rPr>
-        <w:t>cd ..</w:t>
-      </w:r>
-    </w:p>
-    <w:p>
-      <w:pPr>
-        <w:keepNext w:val="0"/>
-        <w:keepLines/>
-        <w:widowControl/>
-        <w:spacing w:after="0" w:before="0" w:line="240" w:lineRule="auto"/>
-        <w:ind w:firstLine="0" w:left="142" w:right="85"/>
-        <w:jc w:val="left"/>
-      </w:pPr>
-      <w:r>
-        <w:rPr>
-          <w:rFonts w:ascii="Times New Roman" w:hAnsi="Times New Roman"/>
-          <w:b w:val="0"/>
-          <w:sz w:val="26"/>
-        </w:rPr>
-        <w:t>bash Ma_nguon/scripts/check-env.sh</w:t>
-      </w:r>
-    </w:p>
-    <w:p>
-      <w:pPr>
-        <w:widowControl/>
-        <w:spacing w:after="120" w:before="0" w:line="240" w:lineRule="auto"/>
-        <w:ind w:firstLine="0" w:left="142" w:right="85"/>
-        <w:jc w:val="left"/>
-      </w:pPr>
-      <w:r>
-        <w:rPr>
-          <w:rFonts w:ascii="Times New Roman" w:hAnsi="Times New Roman"/>
-          <w:b w:val="0"/>
-          <w:sz w:val="26"/>
-        </w:rPr>
-        <w:t>cd Ma_nguon</w:t>
+        <w:t xml:space="preserve"> trước khi đối chiếu với bản mẫu.</w:t>
       </w:r>
     </w:p>
     <w:p>
@@ -3733,28 +2910,9 @@
         <w:rPr>
           <w:rFonts w:ascii="Times New Roman" w:hAnsi="Times New Roman"/>
           <w:b w:val="0"/>
-          <w:color w:val="000000"/>
           <w:sz w:val="26"/>
         </w:rPr>
-        <w:t xml:space="preserve">Script vẫn tìm được tệp vì dùng </w:t>
-      </w:r>
-      <w:r>
-        <w:rPr>
-          <w:rFonts w:ascii="Times New Roman" w:hAnsi="Times New Roman"/>
-          <w:b w:val="0"/>
-          <w:color w:val="000000"/>
-          <w:sz w:val="26"/>
-        </w:rPr>
-        <w:t>root</w:t>
-      </w:r>
-      <w:r>
-        <w:rPr>
-          <w:rFonts w:ascii="Times New Roman" w:hAnsi="Times New Roman"/>
-          <w:b w:val="0"/>
-          <w:color w:val="000000"/>
-          <w:sz w:val="26"/>
-        </w:rPr>
-        <w:t>. Đây là lý do không nên viết mọi đường dẫn phụ thuộc vào nơi người dùng đang đứng.</w:t>
+        <w:t>Thử các cặp (10, 11), (0, 0), (10, -1); cả ba đều không được đăng ký. Lập bảng ghi dữ liệu đầu vào, kết quả yêu cầu và kết quả thực tế.</w:t>
       </w:r>
     </w:p>
     <w:p>
@@ -3781,19 +2939,9 @@
         <w:rPr>
           <w:rFonts w:ascii="Times New Roman" w:hAnsi="Times New Roman"/>
           <w:b w:val="0"/>
-          <w:color w:val="000000"/>
           <w:sz w:val="26"/>
         </w:rPr>
-        <w:t>[</w:t>
-      </w:r>
-      <w:r>
-        <w:rPr>
-          <w:rFonts w:ascii="Times New Roman" w:hAnsi="Times New Roman"/>
-          <w:b w:val="0"/>
-          <w:color w:val="000000"/>
-          <w:sz w:val="26"/>
-        </w:rPr>
-        <w:t xml:space="preserve"> ] Chạy từ thư mục cha vẫn tìm được README và public/index.php.</w:t>
+        <w:t>[ ] Khi thay dữ liệu đầu vào, chương trình trả kết quả phù hợp với quy tắc đã xác định.</w:t>
       </w:r>
     </w:p>
     <w:p>
@@ -3809,111 +2957,7 @@
           <w:color w:val="000000"/>
           <w:sz w:val="26"/>
         </w:rPr>
-        <w:t>Bước 6. Tạo lỗi có kiểm soát rồi khôi phục</w:t>
-      </w:r>
-    </w:p>
-    <w:p>
-      <w:pPr>
-        <w:keepNext/>
-        <w:widowControl/>
-      </w:pPr>
-      <w:r>
-        <w:rPr>
-          <w:rFonts w:ascii="Times New Roman" w:hAnsi="Times New Roman"/>
-          <w:b w:val="0"/>
-          <w:sz w:val="26"/>
-        </w:rPr>
-        <w:t>Thực hiện tại thư mục Ma_nguon của bài:</w:t>
-      </w:r>
-    </w:p>
-    <w:p>
-      <w:pPr>
-        <w:keepNext/>
-        <w:keepLines/>
-        <w:widowControl/>
-        <w:spacing w:after="0" w:before="0" w:line="240" w:lineRule="auto"/>
-        <w:ind w:firstLine="0" w:left="142" w:right="85"/>
-        <w:jc w:val="left"/>
-      </w:pPr>
-      <w:r>
-        <w:rPr>
-          <w:rFonts w:ascii="Times New Roman" w:hAnsi="Times New Roman"/>
-          <w:b w:val="0"/>
-          <w:sz w:val="26"/>
-        </w:rPr>
-        <w:t>mv README.md README.backup</w:t>
-      </w:r>
-    </w:p>
-    <w:p>
-      <w:pPr>
-        <w:keepNext/>
-        <w:keepLines/>
-        <w:widowControl/>
-        <w:spacing w:after="0" w:before="0" w:line="240" w:lineRule="auto"/>
-        <w:ind w:firstLine="0" w:left="142" w:right="85"/>
-        <w:jc w:val="left"/>
-      </w:pPr>
-      <w:r>
-        <w:rPr>
-          <w:rFonts w:ascii="Times New Roman" w:hAnsi="Times New Roman"/>
-          <w:b w:val="0"/>
-          <w:sz w:val="26"/>
-        </w:rPr>
-        <w:t>bash scripts/check-env.sh</w:t>
-      </w:r>
-    </w:p>
-    <w:p>
-      <w:pPr>
-        <w:keepNext/>
-        <w:keepLines/>
-        <w:widowControl/>
-        <w:spacing w:after="0" w:before="0" w:line="240" w:lineRule="auto"/>
-        <w:ind w:firstLine="0" w:left="142" w:right="85"/>
-        <w:jc w:val="left"/>
-      </w:pPr>
-      <w:r>
-        <w:rPr>
-          <w:rFonts w:ascii="Times New Roman" w:hAnsi="Times New Roman"/>
-          <w:b w:val="0"/>
-          <w:sz w:val="26"/>
-        </w:rPr>
-        <w:t>echo "exit=$?"</w:t>
-      </w:r>
-    </w:p>
-    <w:p>
-      <w:pPr>
-        <w:keepNext/>
-        <w:keepLines/>
-        <w:widowControl/>
-        <w:spacing w:after="0" w:before="0" w:line="240" w:lineRule="auto"/>
-        <w:ind w:firstLine="0" w:left="142" w:right="85"/>
-        <w:jc w:val="left"/>
-      </w:pPr>
-      <w:r>
-        <w:rPr>
-          <w:rFonts w:ascii="Times New Roman" w:hAnsi="Times New Roman"/>
-          <w:b w:val="0"/>
-          <w:sz w:val="26"/>
-        </w:rPr>
-        <w:t>mv README.backup README.md</w:t>
-      </w:r>
-    </w:p>
-    <w:p>
-      <w:pPr>
-        <w:keepNext w:val="0"/>
-        <w:keepLines/>
-        <w:widowControl/>
-        <w:spacing w:after="0" w:before="0" w:line="240" w:lineRule="auto"/>
-        <w:ind w:firstLine="0" w:left="142" w:right="85"/>
-        <w:jc w:val="left"/>
-      </w:pPr>
-      <w:r>
-        <w:rPr>
-          <w:rFonts w:ascii="Times New Roman" w:hAnsi="Times New Roman"/>
-          <w:b w:val="0"/>
-          <w:sz w:val="26"/>
-        </w:rPr>
-        <w:t>bash scripts/check-env.sh</w:t>
+        <w:t>Bước 6. Dùng bộ kiểm thử đã cấp</w:t>
       </w:r>
     </w:p>
     <w:p>
@@ -3929,7 +2973,20 @@
           <w:b w:val="0"/>
           <w:sz w:val="26"/>
         </w:rPr>
-        <w:t>echo "exit=$?"</w:t>
+        <w:t>php tests/run.php</w:t>
+      </w:r>
+    </w:p>
+    <w:p>
+      <w:pPr>
+        <w:widowControl/>
+      </w:pPr>
+      <w:r>
+        <w:rPr>
+          <w:rFonts w:ascii="Times New Roman" w:hAnsi="Times New Roman"/>
+          <w:b w:val="0"/>
+          <w:sz w:val="26"/>
+        </w:rPr>
+        <w:t>Mở tests/run.php và đọc các lời gọi same(...). Hàm so sánh kết quả của chương trình với giá trị yêu cầu; nhãn của ca kiểm thử giúp xác định trường hợp sai. Giữ nguyên các giá trị yêu cầu khi sửa chương trình.</w:t>
       </w:r>
     </w:p>
     <w:p>
@@ -3943,7 +3000,7 @@
           <w:color w:val="000000"/>
           <w:sz w:val="26"/>
         </w:rPr>
-        <w:t xml:space="preserve">Lần thiếu tệp có </w:t>
+        <w:t xml:space="preserve">Thử tạm đổi </w:t>
       </w:r>
       <w:r>
         <w:rPr>
@@ -3952,7 +3009,7 @@
           <w:color w:val="000000"/>
           <w:sz w:val="26"/>
         </w:rPr>
-        <w:t>MISSING file README.md</w:t>
+        <w:t>&lt;</w:t>
       </w:r>
       <w:r>
         <w:rPr>
@@ -3961,7 +3018,7 @@
           <w:color w:val="000000"/>
           <w:sz w:val="26"/>
         </w:rPr>
-        <w:t xml:space="preserve"> và mã </w:t>
+        <w:t xml:space="preserve"> thành </w:t>
       </w:r>
       <w:r>
         <w:rPr>
@@ -3970,7 +3027,7 @@
           <w:color w:val="000000"/>
           <w:sz w:val="26"/>
         </w:rPr>
-        <w:t>2</w:t>
+        <w:t>&lt;=</w:t>
       </w:r>
       <w:r>
         <w:rPr>
@@ -3979,7 +3036,7 @@
           <w:color w:val="000000"/>
           <w:sz w:val="26"/>
         </w:rPr>
-        <w:t xml:space="preserve">. Sau khi đổi tên trở lại, kết quả là </w:t>
+        <w:t xml:space="preserve"> trong lớp rồi chạy test: ca sức chứa bằng số đã đăng ký phải bị phát hiện. Khôi phục </w:t>
       </w:r>
       <w:r>
         <w:rPr>
@@ -3988,7 +3045,7 @@
           <w:color w:val="000000"/>
           <w:sz w:val="26"/>
         </w:rPr>
-        <w:t>CHECK_ENV=PASS</w:t>
+        <w:t>&lt;</w:t>
       </w:r>
       <w:r>
         <w:rPr>
@@ -3997,43 +3054,7 @@
           <w:color w:val="000000"/>
           <w:sz w:val="26"/>
         </w:rPr>
-        <w:t xml:space="preserve"> và mã </w:t>
-      </w:r>
-      <w:r>
-        <w:rPr>
-          <w:rFonts w:ascii="Times New Roman" w:hAnsi="Times New Roman"/>
-          <w:b w:val="0"/>
-          <w:color w:val="000000"/>
-          <w:sz w:val="26"/>
-        </w:rPr>
-        <w:t>0</w:t>
-      </w:r>
-      <w:r>
-        <w:rPr>
-          <w:rFonts w:ascii="Times New Roman" w:hAnsi="Times New Roman"/>
-          <w:b w:val="0"/>
-          <w:color w:val="000000"/>
-          <w:sz w:val="26"/>
-        </w:rPr>
-        <w:t xml:space="preserve">. Không dùng </w:t>
-      </w:r>
-      <w:r>
-        <w:rPr>
-          <w:rFonts w:ascii="Times New Roman" w:hAnsi="Times New Roman"/>
-          <w:b w:val="0"/>
-          <w:color w:val="000000"/>
-          <w:sz w:val="26"/>
-        </w:rPr>
-        <w:t>rm</w:t>
-      </w:r>
-      <w:r>
-        <w:rPr>
-          <w:rFonts w:ascii="Times New Roman" w:hAnsi="Times New Roman"/>
-          <w:b w:val="0"/>
-          <w:color w:val="000000"/>
-          <w:sz w:val="26"/>
-        </w:rPr>
-        <w:t xml:space="preserve"> để xóa tài liệu gốc.</w:t>
+        <w:t xml:space="preserve"> và chạy lại. Đây là kiểm thử hồi quy: giúp lần sửa sau không làm hỏng hành vi cũ.</w:t>
       </w:r>
     </w:p>
     <w:p>
@@ -4072,96 +3093,12 @@
           <w:color w:val="000000"/>
           <w:sz w:val="26"/>
         </w:rPr>
-        <w:t xml:space="preserve"> ] Đổi tên README báo mã 2; khôi phục báo mã 0, không mất tệp.</w:t>
-      </w:r>
-    </w:p>
-    <w:p>
-      <w:pPr>
-        <w:pStyle w:val="Heading3"/>
-        <w:keepNext/>
-        <w:widowControl/>
-      </w:pPr>
-      <w:r>
-        <w:rPr>
-          <w:rFonts w:ascii="Times New Roman" w:hAnsi="Times New Roman"/>
-          <w:b/>
-          <w:color w:val="000000"/>
-          <w:sz w:val="26"/>
-        </w:rPr>
-        <w:t>Bước 7. Khởi chạy lại phần mềm</w:t>
-      </w:r>
-    </w:p>
-    <w:p>
-      <w:pPr>
-        <w:widowControl/>
-        <w:spacing w:after="120" w:before="0" w:line="240" w:lineRule="auto"/>
-        <w:ind w:firstLine="0" w:left="142" w:right="85"/>
-        <w:jc w:val="left"/>
-      </w:pPr>
-      <w:r>
-        <w:rPr>
-          <w:rFonts w:ascii="Times New Roman" w:hAnsi="Times New Roman"/>
-          <w:b w:val="0"/>
-          <w:sz w:val="26"/>
-        </w:rPr>
-        <w:t>bash lab.sh run</w:t>
-      </w:r>
-    </w:p>
-    <w:p>
-      <w:pPr>
-        <w:widowControl/>
-      </w:pPr>
-      <w:r>
-        <w:rPr>
-          <w:rFonts w:ascii="Times New Roman" w:hAnsi="Times New Roman"/>
-          <w:b w:val="0"/>
-          <w:sz w:val="26"/>
-        </w:rPr>
-        <w:t>Mở lại trang trong trình duyệt để kiểm tra ứng dụng. Script scripts/check-env.sh là phần sinh viên thực hiện; lab.sh run chỉ hỗ trợ khởi chạy máy chủ. Nhấn Ctrl+C để dừng máy chủ trước khi chuyển nội dung.</w:t>
-      </w:r>
-    </w:p>
-    <w:p>
-      <w:pPr>
-        <w:keepNext/>
-        <w:widowControl/>
-      </w:pPr>
-      <w:r>
-        <w:rPr>
-          <w:rFonts w:ascii="Times New Roman" w:hAnsi="Times New Roman"/>
-          <w:b w:val="0"/>
-          <w:sz w:val="26"/>
-        </w:rPr>
-        <w:t>Kiểm tra kết quả bước 7:</w:t>
-      </w:r>
-    </w:p>
-    <w:p>
-      <w:pPr>
-        <w:widowControl/>
-        <w:ind w:firstLine="0" w:left="0"/>
-        <w:jc w:val="left"/>
-      </w:pPr>
-      <w:r>
-        <w:rPr>
-          <w:rFonts w:ascii="Times New Roman" w:hAnsi="Times New Roman"/>
-          <w:b w:val="0"/>
-          <w:color w:val="000000"/>
-          <w:sz w:val="26"/>
-        </w:rPr>
-        <w:t>[</w:t>
-      </w:r>
-      <w:r>
-        <w:rPr>
-          <w:rFonts w:ascii="Times New Roman" w:hAnsi="Times New Roman"/>
-          <w:b w:val="0"/>
-          <w:color w:val="000000"/>
-          <w:sz w:val="26"/>
-        </w:rPr>
-        <w:t xml:space="preserve"> ] Trình duyệt tại cổng 8101 hiện trang mẫu; biết dừng máy chủ bằng Ctrl+C.</w:t>
+        <w:t xml:space="preserve"> ] Năm ca cơ bản đạt; giải thích được ca đầy chỗ và ca sức chứa sai.</w:t>
       </w:r>
     </w:p>
     <w:p>
       <w:r>
-        <w:t>Kết quả sau phần hướng dẫn: bash lab.sh test: có CHECK_ENV=PASS, mã thoát 0. Trang mẫu ở cổng 8101.</w:t>
+        <w:t>Kết quả sau phần hướng dẫn: bash lab.sh run: AVAILABLE với (10, 9). bash lab.sh test: TESTS=5 FAILED=0.</w:t>
       </w:r>
     </w:p>
     <w:p>
@@ -4250,7 +3187,7 @@
                 <w:color w:val="000000"/>
                 <w:sz w:val="26"/>
               </w:rPr>
-              <w:t>Kiểm tra và cách sửa</w:t>
+              <w:t>Nguyên nhân thường gặp và cách kiểm tra</w:t>
             </w:r>
           </w:p>
         </w:tc>
@@ -4281,7 +3218,7 @@
                 <w:color w:val="000000"/>
                 <w:sz w:val="26"/>
               </w:rPr>
-              <w:t>No such file or directory</w:t>
+              <w:t>Class ... not found</w:t>
             </w:r>
           </w:p>
         </w:tc>
@@ -4307,7 +3244,25 @@
                 <w:color w:val="000000"/>
                 <w:sz w:val="26"/>
               </w:rPr>
-              <w:t>Chạy pwd, ls; bảo đảm đứng ở Ma_nguon, không phải thư mục Sinh_vien.</w:t>
+              <w:t xml:space="preserve">Kiểm tra tên lớp, tên tệp và đường dẫn </w:t>
+            </w:r>
+            <w:r>
+              <w:rPr>
+                <w:rFonts w:ascii="Times New Roman" w:hAnsi="Times New Roman"/>
+                <w:b w:val="0"/>
+                <w:color w:val="000000"/>
+                <w:sz w:val="26"/>
+              </w:rPr>
+              <w:t>require</w:t>
+            </w:r>
+            <w:r>
+              <w:rPr>
+                <w:rFonts w:ascii="Times New Roman" w:hAnsi="Times New Roman"/>
+                <w:b w:val="0"/>
+                <w:color w:val="000000"/>
+                <w:sz w:val="26"/>
+              </w:rPr>
+              <w:t>.</w:t>
             </w:r>
           </w:p>
         </w:tc>
@@ -4338,7 +3293,7 @@
                 <w:color w:val="000000"/>
                 <w:sz w:val="26"/>
               </w:rPr>
-              <w:t>php: command not found</w:t>
+              <w:t>Failed opening required</w:t>
             </w:r>
           </w:p>
         </w:tc>
@@ -4364,7 +3319,34 @@
                 <w:color w:val="000000"/>
                 <w:sz w:val="26"/>
               </w:rPr>
-              <w:t>Thực hiện phần cài công cụ trong mục I của bài này; không sửa script để bỏ qua điều kiện thiếu PHP.</w:t>
+              <w:t>CapacityPolicy.php</w:t>
+            </w:r>
+            <w:r>
+              <w:rPr>
+                <w:rFonts w:ascii="Times New Roman" w:hAnsi="Times New Roman"/>
+                <w:b w:val="0"/>
+                <w:color w:val="000000"/>
+                <w:sz w:val="26"/>
+              </w:rPr>
+              <w:t xml:space="preserve"> có ở đúng </w:t>
+            </w:r>
+            <w:r>
+              <w:rPr>
+                <w:rFonts w:ascii="Times New Roman" w:hAnsi="Times New Roman"/>
+                <w:b w:val="0"/>
+                <w:color w:val="000000"/>
+                <w:sz w:val="26"/>
+              </w:rPr>
+              <w:t>src</w:t>
+            </w:r>
+            <w:r>
+              <w:rPr>
+                <w:rFonts w:ascii="Times New Roman" w:hAnsi="Times New Roman"/>
+                <w:b w:val="0"/>
+                <w:color w:val="000000"/>
+                <w:sz w:val="26"/>
+              </w:rPr>
+              <w:t xml:space="preserve"> không? Kiểm tra tên chữ hoa/chữ thường trên Linux.</w:t>
             </w:r>
           </w:p>
         </w:tc>
@@ -4395,34 +3377,7 @@
                 <w:color w:val="000000"/>
                 <w:sz w:val="26"/>
               </w:rPr>
-              <w:t xml:space="preserve">Tệp báo </w:t>
-            </w:r>
-            <w:r>
-              <w:rPr>
-                <w:rFonts w:ascii="Times New Roman" w:hAnsi="Times New Roman"/>
-                <w:b w:val="0"/>
-                <w:color w:val="000000"/>
-                <w:sz w:val="26"/>
-              </w:rPr>
-              <w:t>bad interpreter</w:t>
-            </w:r>
-            <w:r>
-              <w:rPr>
-                <w:rFonts w:ascii="Times New Roman" w:hAnsi="Times New Roman"/>
-                <w:b w:val="0"/>
-                <w:color w:val="000000"/>
-                <w:sz w:val="26"/>
-              </w:rPr>
-              <w:t xml:space="preserve"> hoặc chứa ký tự </w:t>
-            </w:r>
-            <w:r>
-              <w:rPr>
-                <w:rFonts w:ascii="Times New Roman" w:hAnsi="Times New Roman"/>
-                <w:b w:val="0"/>
-                <w:color w:val="000000"/>
-                <w:sz w:val="26"/>
-              </w:rPr>
-              <w:t>^M</w:t>
+              <w:t>Parse error</w:t>
             </w:r>
           </w:p>
         </w:tc>
@@ -4448,7 +3403,61 @@
                 <w:color w:val="000000"/>
                 <w:sz w:val="26"/>
               </w:rPr>
-              <w:t>Đổi kiểu xuống dòng từ CRLF sang LF trong trình soạn thảo, rồi lưu lại.</w:t>
+              <w:t xml:space="preserve">Kiểm tra dấu </w:t>
+            </w:r>
+            <w:r>
+              <w:rPr>
+                <w:rFonts w:ascii="Times New Roman" w:hAnsi="Times New Roman"/>
+                <w:b w:val="0"/>
+                <w:color w:val="000000"/>
+                <w:sz w:val="26"/>
+              </w:rPr>
+              <w:t>;</w:t>
+            </w:r>
+            <w:r>
+              <w:rPr>
+                <w:rFonts w:ascii="Times New Roman" w:hAnsi="Times New Roman"/>
+                <w:b w:val="0"/>
+                <w:color w:val="000000"/>
+                <w:sz w:val="26"/>
+              </w:rPr>
+              <w:t xml:space="preserve">, </w:t>
+            </w:r>
+            <w:r>
+              <w:rPr>
+                <w:rFonts w:ascii="Times New Roman" w:hAnsi="Times New Roman"/>
+                <w:b w:val="0"/>
+                <w:color w:val="000000"/>
+                <w:sz w:val="26"/>
+              </w:rPr>
+              <w:t>{}</w:t>
+            </w:r>
+            <w:r>
+              <w:rPr>
+                <w:rFonts w:ascii="Times New Roman" w:hAnsi="Times New Roman"/>
+                <w:b w:val="0"/>
+                <w:color w:val="000000"/>
+                <w:sz w:val="26"/>
+              </w:rPr>
+              <w:t xml:space="preserve">, tên phương thức; chạy </w:t>
+            </w:r>
+            <w:r>
+              <w:rPr>
+                <w:rFonts w:ascii="Times New Roman" w:hAnsi="Times New Roman"/>
+                <w:b w:val="0"/>
+                <w:color w:val="000000"/>
+                <w:sz w:val="26"/>
+              </w:rPr>
+              <w:t>php -l</w:t>
+            </w:r>
+            <w:r>
+              <w:rPr>
+                <w:rFonts w:ascii="Times New Roman" w:hAnsi="Times New Roman"/>
+                <w:b w:val="0"/>
+                <w:color w:val="000000"/>
+                <w:sz w:val="26"/>
+              </w:rPr>
+              <w:t xml:space="preserve"> trước.</w:t>
             </w:r>
           </w:p>
         </w:tc>
@@ -4479,7 +3488,7 @@
                 <w:color w:val="000000"/>
                 <w:sz w:val="26"/>
               </w:rPr>
-              <w:t>Trình duyệt báo không kết nối</w:t>
+              <w:t>Đủ chỗ vẫn được đăng ký</w:t>
             </w:r>
           </w:p>
         </w:tc>
@@ -4505,7 +3514,61 @@
                 <w:color w:val="000000"/>
                 <w:sz w:val="26"/>
               </w:rPr>
-              <w:t>Giữ terminal máy chủ đang chạy; kiểm tra đúng địa chỉ và cổng.</w:t>
+              <w:t xml:space="preserve">Bạn có viết </w:t>
+            </w:r>
+            <w:r>
+              <w:rPr>
+                <w:rFonts w:ascii="Times New Roman" w:hAnsi="Times New Roman"/>
+                <w:b w:val="0"/>
+                <w:color w:val="000000"/>
+                <w:sz w:val="26"/>
+              </w:rPr>
+              <w:t>&lt;=</w:t>
+            </w:r>
+            <w:r>
+              <w:rPr>
+                <w:rFonts w:ascii="Times New Roman" w:hAnsi="Times New Roman"/>
+                <w:b w:val="0"/>
+                <w:color w:val="000000"/>
+                <w:sz w:val="26"/>
+              </w:rPr>
+              <w:t xml:space="preserve"> thay vì </w:t>
+            </w:r>
+            <w:r>
+              <w:rPr>
+                <w:rFonts w:ascii="Times New Roman" w:hAnsi="Times New Roman"/>
+                <w:b w:val="0"/>
+                <w:color w:val="000000"/>
+                <w:sz w:val="26"/>
+              </w:rPr>
+              <w:t>&lt;</w:t>
+            </w:r>
+            <w:r>
+              <w:rPr>
+                <w:rFonts w:ascii="Times New Roman" w:hAnsi="Times New Roman"/>
+                <w:b w:val="0"/>
+                <w:color w:val="000000"/>
+                <w:sz w:val="26"/>
+              </w:rPr>
+              <w:t xml:space="preserve"> không? Chạy ca </w:t>
+            </w:r>
+            <w:r>
+              <w:rPr>
+                <w:rFonts w:ascii="Times New Roman" w:hAnsi="Times New Roman"/>
+                <w:b w:val="0"/>
+                <w:color w:val="000000"/>
+                <w:sz w:val="26"/>
+              </w:rPr>
+              <w:t>10,10</w:t>
+            </w:r>
+            <w:r>
+              <w:rPr>
+                <w:rFonts w:ascii="Times New Roman" w:hAnsi="Times New Roman"/>
+                <w:b w:val="0"/>
+                <w:color w:val="000000"/>
+                <w:sz w:val="26"/>
+              </w:rPr>
+              <w:t>.</w:t>
             </w:r>
           </w:p>
         </w:tc>
@@ -4536,7 +3599,7 @@
                 <w:color w:val="000000"/>
                 <w:sz w:val="26"/>
               </w:rPr>
-              <w:t>Address already in use</w:t>
+              <w:t>Chương trình in chữ nhưng test sai</w:t>
             </w:r>
           </w:p>
         </w:tc>
@@ -4562,7 +3625,43 @@
                 <w:color w:val="000000"/>
                 <w:sz w:val="26"/>
               </w:rPr>
-              <w:t>Dừng máy chủ cũ bằng Ctrl+C. Không chạy hai bản mẫu và bài làm cùng cổng.</w:t>
+              <w:t xml:space="preserve">Không viết </w:t>
+            </w:r>
+            <w:r>
+              <w:rPr>
+                <w:rFonts w:ascii="Times New Roman" w:hAnsi="Times New Roman"/>
+                <w:b w:val="0"/>
+                <w:color w:val="000000"/>
+                <w:sz w:val="26"/>
+              </w:rPr>
+              <w:t>echo</w:t>
+            </w:r>
+            <w:r>
+              <w:rPr>
+                <w:rFonts w:ascii="Times New Roman" w:hAnsi="Times New Roman"/>
+                <w:b w:val="0"/>
+                <w:color w:val="000000"/>
+                <w:sz w:val="26"/>
+              </w:rPr>
+              <w:t xml:space="preserve"> thay cho </w:t>
+            </w:r>
+            <w:r>
+              <w:rPr>
+                <w:rFonts w:ascii="Times New Roman" w:hAnsi="Times New Roman"/>
+                <w:b w:val="0"/>
+                <w:color w:val="000000"/>
+                <w:sz w:val="26"/>
+              </w:rPr>
+              <w:t>return</w:t>
+            </w:r>
+            <w:r>
+              <w:rPr>
+                <w:rFonts w:ascii="Times New Roman" w:hAnsi="Times New Roman"/>
+                <w:b w:val="0"/>
+                <w:color w:val="000000"/>
+                <w:sz w:val="26"/>
+              </w:rPr>
+              <w:t xml:space="preserve"> trong phương thức; test cần giá trị Boolean.</w:t>
             </w:r>
           </w:p>
         </w:tc>
@@ -4586,20 +3685,7 @@
           <w:b/>
           <w:sz w:val="26"/>
         </w:rPr>
-        <w:t>VI. BÀI TẬP MỞ RỘNG: KIỂM TRA NHIỀU TỆP PHP</w:t>
-      </w:r>
-    </w:p>
-    <w:p>
-      <w:pPr>
-        <w:widowControl/>
-      </w:pPr>
-      <w:r>
-        <w:rPr>
-          <w:rFonts w:ascii="Times New Roman" w:hAnsi="Times New Roman"/>
-          <w:b w:val="0"/>
-          <w:sz w:val="26"/>
-        </w:rPr>
-        <w:t>Viết script kiểm tra cú pháp tất cả tệp PHP trong một thư mục, kể cả các thư mục con. Vận dụng cách kiểm tra công cụ, điều kiện và vòng lặp đã thực hiện trong bài mẫu.</w:t>
+        <w:t>VI. BÀI TẬP MỞ RỘNG: BA TRẠNG THÁI ĐĂNG KÝ</w:t>
       </w:r>
     </w:p>
     <w:p>
@@ -4614,7 +3700,61 @@
           <w:color w:val="000000"/>
           <w:sz w:val="26"/>
         </w:rPr>
-        <w:t>Không đổi thư mục. Bài mở rộng dùng thêm một tệp và bộ kiểm thử ngay trong dự án:</w:t>
+        <w:t xml:space="preserve">Yêu cầu mới: sự kiện có thể đang đóng và có thể bật danh sách chờ. Mỗi yêu cầu đăng ký cần nhận một trong ba kết quả: </w:t>
+      </w:r>
+      <w:r>
+        <w:rPr>
+          <w:rFonts w:ascii="Times New Roman" w:hAnsi="Times New Roman"/>
+          <w:b w:val="0"/>
+          <w:color w:val="000000"/>
+          <w:sz w:val="26"/>
+        </w:rPr>
+        <w:t>confirmed</w:t>
+      </w:r>
+      <w:r>
+        <w:rPr>
+          <w:rFonts w:ascii="Times New Roman" w:hAnsi="Times New Roman"/>
+          <w:b w:val="0"/>
+          <w:color w:val="000000"/>
+          <w:sz w:val="26"/>
+        </w:rPr>
+        <w:t xml:space="preserve"> (xác nhận), </w:t>
+      </w:r>
+      <w:r>
+        <w:rPr>
+          <w:rFonts w:ascii="Times New Roman" w:hAnsi="Times New Roman"/>
+          <w:b w:val="0"/>
+          <w:color w:val="000000"/>
+          <w:sz w:val="26"/>
+        </w:rPr>
+        <w:t>waiting</w:t>
+      </w:r>
+      <w:r>
+        <w:rPr>
+          <w:rFonts w:ascii="Times New Roman" w:hAnsi="Times New Roman"/>
+          <w:b w:val="0"/>
+          <w:color w:val="000000"/>
+          <w:sz w:val="26"/>
+        </w:rPr>
+        <w:t xml:space="preserve"> (chờ), </w:t>
+      </w:r>
+      <w:r>
+        <w:rPr>
+          <w:rFonts w:ascii="Times New Roman" w:hAnsi="Times New Roman"/>
+          <w:b w:val="0"/>
+          <w:color w:val="000000"/>
+          <w:sz w:val="26"/>
+        </w:rPr>
+        <w:t>rejected</w:t>
+      </w:r>
+      <w:r>
+        <w:rPr>
+          <w:rFonts w:ascii="Times New Roman" w:hAnsi="Times New Roman"/>
+          <w:b w:val="0"/>
+          <w:color w:val="000000"/>
+          <w:sz w:val="26"/>
+        </w:rPr>
+        <w:t xml:space="preserve"> (từ chối).</w:t>
       </w:r>
     </w:p>
     <w:p>
@@ -4661,7 +3801,7 @@
           <w:b w:val="0"/>
           <w:sz w:val="26"/>
         </w:rPr>
-        <w:t>Mở scripts/scan-source.sh và hoàn thiện ba vị trí TODO: kiểm tra đầu vào, đếm tệp đúng/sai cú pháp và trả kết quả tổng hợp. Phần tìm tệp, xử lý tên có khoảng trắng và dọn tệp tạm đã được cung cấp.</w:t>
+        <w:t>Mở src/RegistrationPolicy.php, giữ tên và tham số của phương thức đã cấp; tự viết phần thân decide.</w:t>
       </w:r>
     </w:p>
     <w:tbl>
@@ -4709,7 +3849,7 @@
                 <w:color w:val="000000"/>
                 <w:sz w:val="26"/>
               </w:rPr>
-              <w:t>Đầu vào kiểm thử</w:t>
+              <w:t>Điều kiện</w:t>
             </w:r>
           </w:p>
         </w:tc>
@@ -4731,6 +3871,8 @@
             <w:r>
               <w:rPr>
                 <w:rFonts w:ascii="Times New Roman" w:hAnsi="Times New Roman"/>
+                <w:b/>
+                <w:color w:val="000000"/>
                 <w:sz w:val="26"/>
               </w:rPr>
               <w:t>Kết quả yêu cầu</w:t>
@@ -4764,7 +3906,7 @@
                 <w:color w:val="000000"/>
                 <w:sz w:val="26"/>
               </w:rPr>
-              <w:t>Hai tệp đúng, một tên đường dẫn có khoảng trắng</w:t>
+              <w:t>Sức chứa ≤ 0, số đã đăng ký &lt; 0 hoặc &gt; sức chứa</w:t>
             </w:r>
           </w:p>
         </w:tc>
@@ -4790,7 +3932,7 @@
                 <w:color w:val="000000"/>
                 <w:sz w:val="26"/>
               </w:rPr>
-              <w:t>TOTAL=2 PASS=2 FAIL=0</w:t>
+              <w:t>rejected</w:t>
             </w:r>
             <w:r>
               <w:rPr>
@@ -4799,7 +3941,7 @@
                 <w:color w:val="000000"/>
                 <w:sz w:val="26"/>
               </w:rPr>
-              <w:t>, mã 0.</w:t>
+              <w:t>.</w:t>
             </w:r>
           </w:p>
         </w:tc>
@@ -4830,7 +3972,7 @@
                 <w:color w:val="000000"/>
                 <w:sz w:val="26"/>
               </w:rPr>
-              <w:t>Ba tệp, trong đó một tệp sai cú pháp</w:t>
+              <w:t>Dữ liệu hợp lệ nhưng sự kiện đóng</w:t>
             </w:r>
           </w:p>
         </w:tc>
@@ -4856,7 +3998,7 @@
                 <w:color w:val="000000"/>
                 <w:sz w:val="26"/>
               </w:rPr>
-              <w:t xml:space="preserve">Kiểm tra đủ ba tệp; </w:t>
+              <w:t>rejected</w:t>
             </w:r>
             <w:r>
               <w:rPr>
@@ -4865,16 +4007,7 @@
                 <w:color w:val="000000"/>
                 <w:sz w:val="26"/>
               </w:rPr>
-              <w:t>TOTAL=3 PASS=2 FAIL=1</w:t>
-            </w:r>
-            <w:r>
-              <w:rPr>
-                <w:rFonts w:ascii="Times New Roman" w:hAnsi="Times New Roman"/>
-                <w:b w:val="0"/>
-                <w:color w:val="000000"/>
-                <w:sz w:val="26"/>
-              </w:rPr>
-              <w:t>, mã 1.</w:t>
+              <w:t>, kể cả vẫn còn chỗ.</w:t>
             </w:r>
           </w:p>
         </w:tc>
@@ -4905,7 +4038,7 @@
                 <w:color w:val="000000"/>
                 <w:sz w:val="26"/>
               </w:rPr>
-              <w:t>Thư mục không tồn tại</w:t>
+              <w:t>Sự kiện mở và còn chỗ</w:t>
             </w:r>
           </w:p>
         </w:tc>
@@ -4931,7 +4064,16 @@
                 <w:color w:val="000000"/>
                 <w:sz w:val="26"/>
               </w:rPr>
-              <w:t>Báo lỗi và mã 2.</w:t>
+              <w:t>confirmed</w:t>
+            </w:r>
+            <w:r>
+              <w:rPr>
+                <w:rFonts w:ascii="Times New Roman" w:hAnsi="Times New Roman"/>
+                <w:b w:val="0"/>
+                <w:color w:val="000000"/>
+                <w:sz w:val="26"/>
+              </w:rPr>
+              <w:t>.</w:t>
             </w:r>
           </w:p>
         </w:tc>
@@ -4962,7 +4104,7 @@
                 <w:color w:val="000000"/>
                 <w:sz w:val="26"/>
               </w:rPr>
-              <w:t>Thư mục không có tệp PHP</w:t>
+              <w:t>Sự kiện mở, hết chỗ, có danh sách chờ</w:t>
             </w:r>
           </w:p>
         </w:tc>
@@ -4988,7 +4130,82 @@
                 <w:color w:val="000000"/>
                 <w:sz w:val="26"/>
               </w:rPr>
-              <w:t>Báo không có tệp để kiểm tra và mã 2.</w:t>
+              <w:t>waiting</w:t>
+            </w:r>
+            <w:r>
+              <w:rPr>
+                <w:rFonts w:ascii="Times New Roman" w:hAnsi="Times New Roman"/>
+                <w:b w:val="0"/>
+                <w:color w:val="000000"/>
+                <w:sz w:val="26"/>
+              </w:rPr>
+              <w:t>.</w:t>
+            </w:r>
+          </w:p>
+        </w:tc>
+      </w:tr>
+      <w:tr>
+        <w:trPr>
+          <w:cantSplit/>
+        </w:trPr>
+        <w:tc>
+          <w:tcPr>
+            <w:tcW w:type="dxa" w:w="1701"/>
+            <w:tcMar>
+              <w:left w:w="75" w:type="dxa"/>
+              <w:right w:w="75" w:type="dxa"/>
+            </w:tcMar>
+          </w:tcPr>
+          <w:p>
+            <w:pPr>
+              <w:widowControl/>
+              <w:spacing w:line="240" w:lineRule="auto" w:after="80" w:before="80"/>
+              <w:ind w:firstLine="0"/>
+              <w:jc w:val="left"/>
+            </w:pPr>
+            <w:r>
+              <w:rPr>
+                <w:rFonts w:ascii="Times New Roman" w:hAnsi="Times New Roman"/>
+                <w:b w:val="0"/>
+                <w:color w:val="000000"/>
+                <w:sz w:val="26"/>
+              </w:rPr>
+              <w:t>Sự kiện mở, hết chỗ, không có danh sách chờ</w:t>
+            </w:r>
+          </w:p>
+        </w:tc>
+        <w:tc>
+          <w:tcPr>
+            <w:tcW w:type="dxa" w:w="7370"/>
+            <w:tcMar>
+              <w:left w:w="75" w:type="dxa"/>
+              <w:right w:w="75" w:type="dxa"/>
+            </w:tcMar>
+          </w:tcPr>
+          <w:p>
+            <w:pPr>
+              <w:widowControl/>
+              <w:spacing w:line="240" w:lineRule="auto" w:after="80" w:before="80"/>
+              <w:ind w:firstLine="0"/>
+              <w:jc w:val="left"/>
+            </w:pPr>
+            <w:r>
+              <w:rPr>
+                <w:rFonts w:ascii="Times New Roman" w:hAnsi="Times New Roman"/>
+                <w:b w:val="0"/>
+                <w:color w:val="000000"/>
+                <w:sz w:val="26"/>
+              </w:rPr>
+              <w:t>rejected</w:t>
+            </w:r>
+            <w:r>
+              <w:rPr>
+                <w:rFonts w:ascii="Times New Roman" w:hAnsi="Times New Roman"/>
+                <w:b w:val="0"/>
+                <w:color w:val="000000"/>
+                <w:sz w:val="26"/>
+              </w:rPr>
+              <w:t>.</w:t>
             </w:r>
           </w:p>
         </w:tc>
@@ -5010,7 +4227,7 @@
           <w:b w:val="0"/>
           <w:sz w:val="26"/>
         </w:rPr>
-        <w:t>Chạy bash lab.sh extend. Kết quả yêu cầu là SHELL_CASES=4 FAILED=0. Bản khởi đầu có thể chưa đạt vì còn TODO. Đặt php -l trong nhánh if để tiếp tục kiểm tra các tệp còn lại khi phát hiện một tệp lỗi.</w:t>
+        <w:t>Kiểm tra tính hợp lệ của dữ liệu và trạng thái đóng của sự kiện trước khi xét số chỗ. Chạy bash lab.sh extend, bổ sung ít nhất một ca kiểm thử và giải thích mục đích của ca đó. Phần nâng cao: bổ sung mã lý do cho kết quả nhưng giữ nguyên giao diện của phương thức bắt buộc.</w:t>
       </w:r>
     </w:p>
     <w:p>
@@ -5027,7 +4244,7 @@
     <w:p>
       <w:pPr/>
       <w:r>
-        <w:t>Hoàn thành script kiểm tra môi trường và script quét mã PHP; xử lý được thư mục thiếu, thư mục rỗng, tệp sai cú pháp và đường dẫn có khoảng trắng.</w:t>
+        <w:t>Có lớp kiểm tra sức chứa, chương trình gọi lớp và lớp mở rộng trả confirmed, waiting hoặc rejected theo quy tắc đã công bố.</w:t>
       </w:r>
     </w:p>
     <w:p>
@@ -5044,37 +4261,37 @@
     <w:p>
       <w:pPr/>
       <w:r>
-        <w:t>[ ] Script kiểm tra đủ PHP, Git và tệp cần thiết.</w:t>
+        <w:t>[ ] Giải thích được đầu vào và giá trị trả về của canRegister().</w:t>
       </w:r>
     </w:p>
     <w:p>
       <w:pPr/>
       <w:r>
-        <w:t>[ ] Bộ quét kiểm tra cả thư mục con và đường dẫn có khoảng trắng.</w:t>
+        <w:t>[ ] demo.php gọi đúng lớp và in kết quả theo dữ liệu thử.</w:t>
       </w:r>
     </w:p>
     <w:p>
       <w:pPr/>
       <w:r>
-        <w:t>[ ] Kết quả tổng hợp khớp số tệp; từng tình huống có mã thoát đúng.</w:t>
+        <w:t>[ ] decide() trả đúng ba trạng thái và thứ tự ưu tiên.</w:t>
       </w:r>
     </w:p>
     <w:p>
       <w:pPr/>
       <w:r>
-        <w:t>[ ] Dữ liệu thử vẫn còn nguyên sau khi kiểm tra.</w:t>
+        <w:t>[ ] Các ca đúng, sai và biên có kết quả đối chiếu.</w:t>
       </w:r>
     </w:p>
     <w:p>
       <w:pPr/>
       <w:r>
-        <w:t>[ ] Chạy lại test và extend đều đạt trên bản mã nộp.</w:t>
+        <w:t>[ ] test và extend đạt; không sửa đáp án trong bộ kiểm thử.</w:t>
       </w:r>
     </w:p>
     <w:p>
       <w:pPr/>
       <w:r>
-        <w:t>Kết quả tổng hợp của phần tự làm phải có SHELL_CASES=4 FAILED=0. Ngoài các phép thử tự động, thực hiện các tình huống kiểm tra trực tiếp nêu trong bài. Lệnh check chỉ xác nhận môi trường, không thay cho test và extend.</w:t>
+        <w:t>Kết quả tổng hợp của phần tự làm phải có TESTS=8 FAILED=0. Ngoài các phép thử tự động, thực hiện các tình huống kiểm tra trực tiếp nêu trong bài. Lệnh check chỉ xác nhận môi trường, không thay cho test và extend.</w:t>
       </w:r>
     </w:p>
     <w:p>
@@ -5258,7 +4475,143 @@
                 <w:b w:val="0"/>
                 <w:sz w:val="26"/>
               </w:rPr>
-              <w:t>Kiểm tra đầu vào</w:t>
+              <w:t>Dữ liệu và trạng thái đóng</w:t>
+            </w:r>
+          </w:p>
+        </w:tc>
+        <w:tc>
+          <w:tcPr>
+            <w:tcW w:type="dxa" w:w="964"/>
+          </w:tcPr>
+          <w:p>
+            <w:pPr>
+              <w:keepNext/>
+              <w:spacing w:after="40" w:before="0" w:line="240" w:lineRule="auto"/>
+              <w:ind w:firstLine="0"/>
+              <w:jc w:val="left"/>
+            </w:pPr>
+            <w:r>
+              <w:rPr>
+                <w:rFonts w:ascii="Times New Roman" w:hAnsi="Times New Roman"/>
+                <w:b w:val="0"/>
+                <w:sz w:val="26"/>
+              </w:rPr>
+              <w:t>1,5</w:t>
+            </w:r>
+          </w:p>
+        </w:tc>
+        <w:tc>
+          <w:tcPr>
+            <w:tcW w:type="dxa" w:w="6123"/>
+          </w:tcPr>
+          <w:p>
+            <w:pPr>
+              <w:keepNext/>
+              <w:spacing w:after="40" w:before="0" w:line="240" w:lineRule="auto"/>
+              <w:ind w:firstLine="0"/>
+              <w:jc w:val="left"/>
+            </w:pPr>
+            <w:r>
+              <w:rPr>
+                <w:rFonts w:ascii="Times New Roman" w:hAnsi="Times New Roman"/>
+                <w:b w:val="0"/>
+                <w:sz w:val="26"/>
+              </w:rPr>
+              <w:t>Từ chối sức chứa không hợp lệ, số đăng ký âm/vượt sức chứa và sự kiện đã đóng.</w:t>
+            </w:r>
+          </w:p>
+        </w:tc>
+      </w:tr>
+      <w:tr>
+        <w:trPr>
+          <w:cantSplit/>
+        </w:trPr>
+        <w:tc>
+          <w:tcPr>
+            <w:tcW w:type="dxa" w:w="1984"/>
+          </w:tcPr>
+          <w:p>
+            <w:pPr>
+              <w:keepNext/>
+              <w:spacing w:after="40" w:before="0" w:line="240" w:lineRule="auto"/>
+              <w:ind w:firstLine="0"/>
+              <w:jc w:val="left"/>
+            </w:pPr>
+            <w:r>
+              <w:rPr>
+                <w:rFonts w:ascii="Times New Roman" w:hAnsi="Times New Roman"/>
+                <w:b w:val="0"/>
+                <w:sz w:val="26"/>
+              </w:rPr>
+              <w:t>Xác nhận và danh sách chờ</w:t>
+            </w:r>
+          </w:p>
+        </w:tc>
+        <w:tc>
+          <w:tcPr>
+            <w:tcW w:type="dxa" w:w="964"/>
+          </w:tcPr>
+          <w:p>
+            <w:pPr>
+              <w:keepNext/>
+              <w:spacing w:after="40" w:before="0" w:line="240" w:lineRule="auto"/>
+              <w:ind w:firstLine="0"/>
+              <w:jc w:val="left"/>
+            </w:pPr>
+            <w:r>
+              <w:rPr>
+                <w:rFonts w:ascii="Times New Roman" w:hAnsi="Times New Roman"/>
+                <w:b w:val="0"/>
+                <w:sz w:val="26"/>
+              </w:rPr>
+              <w:t>1,5</w:t>
+            </w:r>
+          </w:p>
+        </w:tc>
+        <w:tc>
+          <w:tcPr>
+            <w:tcW w:type="dxa" w:w="6123"/>
+          </w:tcPr>
+          <w:p>
+            <w:pPr>
+              <w:keepNext/>
+              <w:spacing w:after="40" w:before="0" w:line="240" w:lineRule="auto"/>
+              <w:ind w:firstLine="0"/>
+              <w:jc w:val="left"/>
+            </w:pPr>
+            <w:r>
+              <w:rPr>
+                <w:rFonts w:ascii="Times New Roman" w:hAnsi="Times New Roman"/>
+                <w:b w:val="0"/>
+                <w:sz w:val="26"/>
+              </w:rPr>
+              <w:t>Trả confirmed khi còn chỗ; waiting chỉ khi đầy và cho chờ; các trường hợp còn lại rejected.</w:t>
+            </w:r>
+          </w:p>
+        </w:tc>
+      </w:tr>
+      <w:tr>
+        <w:trPr>
+          <w:cantSplit/>
+        </w:trPr>
+        <w:tc>
+          <w:tcPr>
+            <w:tcW w:type="dxa" w:w="1984"/>
+          </w:tcPr>
+          <w:p>
+            <w:pPr>
+              <w:keepNext/>
+              <w:spacing w:after="40" w:before="0" w:line="240" w:lineRule="auto"/>
+              <w:ind w:firstLine="0"/>
+              <w:jc w:val="left"/>
+            </w:pPr>
+            <w:r>
+              <w:rPr>
+                <w:rFonts w:ascii="Times New Roman" w:hAnsi="Times New Roman"/>
+                <w:b w:val="0"/>
+                <w:sz w:val="26"/>
+              </w:rPr>
+              <w:t>Tổ chức module</w:t>
             </w:r>
           </w:p>
         </w:tc>
@@ -5300,143 +4653,7 @@
                 <w:b w:val="0"/>
                 <w:sz w:val="26"/>
               </w:rPr>
-              <w:t>Từ chối thư mục thiếu/không đọc được; báo mã 2 cho thư mục không có PHP.</w:t>
-            </w:r>
-          </w:p>
-        </w:tc>
-      </w:tr>
-      <w:tr>
-        <w:trPr>
-          <w:cantSplit/>
-        </w:trPr>
-        <w:tc>
-          <w:tcPr>
-            <w:tcW w:type="dxa" w:w="1984"/>
-          </w:tcPr>
-          <w:p>
-            <w:pPr>
-              <w:keepNext/>
-              <w:spacing w:after="40" w:before="0" w:line="240" w:lineRule="auto"/>
-              <w:ind w:firstLine="0"/>
-              <w:jc w:val="left"/>
-            </w:pPr>
-            <w:r>
-              <w:rPr>
-                <w:rFonts w:ascii="Times New Roman" w:hAnsi="Times New Roman"/>
-                <w:b w:val="0"/>
-                <w:sz w:val="26"/>
-              </w:rPr>
-              <w:t>Duyệt và kiểm tra tệp</w:t>
-            </w:r>
-          </w:p>
-        </w:tc>
-        <w:tc>
-          <w:tcPr>
-            <w:tcW w:type="dxa" w:w="964"/>
-          </w:tcPr>
-          <w:p>
-            <w:pPr>
-              <w:keepNext/>
-              <w:spacing w:after="40" w:before="0" w:line="240" w:lineRule="auto"/>
-              <w:ind w:firstLine="0"/>
-              <w:jc w:val="left"/>
-            </w:pPr>
-            <w:r>
-              <w:rPr>
-                <w:rFonts w:ascii="Times New Roman" w:hAnsi="Times New Roman"/>
-                <w:b w:val="0"/>
-                <w:sz w:val="26"/>
-              </w:rPr>
-              <w:t>1,5</w:t>
-            </w:r>
-          </w:p>
-        </w:tc>
-        <w:tc>
-          <w:tcPr>
-            <w:tcW w:type="dxa" w:w="6123"/>
-          </w:tcPr>
-          <w:p>
-            <w:pPr>
-              <w:keepNext/>
-              <w:spacing w:after="40" w:before="0" w:line="240" w:lineRule="auto"/>
-              <w:ind w:firstLine="0"/>
-              <w:jc w:val="left"/>
-            </w:pPr>
-            <w:r>
-              <w:rPr>
-                <w:rFonts w:ascii="Times New Roman" w:hAnsi="Times New Roman"/>
-                <w:b w:val="0"/>
-                <w:sz w:val="26"/>
-              </w:rPr>
-              <w:t>Kiểm tra đệ quy, giữ đúng tên có khoảng trắng; không dừng ở tệp lỗi đầu tiên.</w:t>
-            </w:r>
-          </w:p>
-        </w:tc>
-      </w:tr>
-      <w:tr>
-        <w:trPr>
-          <w:cantSplit/>
-        </w:trPr>
-        <w:tc>
-          <w:tcPr>
-            <w:tcW w:type="dxa" w:w="1984"/>
-          </w:tcPr>
-          <w:p>
-            <w:pPr>
-              <w:keepNext/>
-              <w:spacing w:after="40" w:before="0" w:line="240" w:lineRule="auto"/>
-              <w:ind w:firstLine="0"/>
-              <w:jc w:val="left"/>
-            </w:pPr>
-            <w:r>
-              <w:rPr>
-                <w:rFonts w:ascii="Times New Roman" w:hAnsi="Times New Roman"/>
-                <w:b w:val="0"/>
-                <w:sz w:val="26"/>
-              </w:rPr>
-              <w:t>Tổng hợp và mã thoát</w:t>
-            </w:r>
-          </w:p>
-        </w:tc>
-        <w:tc>
-          <w:tcPr>
-            <w:tcW w:type="dxa" w:w="964"/>
-          </w:tcPr>
-          <w:p>
-            <w:pPr>
-              <w:keepNext/>
-              <w:spacing w:after="40" w:before="0" w:line="240" w:lineRule="auto"/>
-              <w:ind w:firstLine="0"/>
-              <w:jc w:val="left"/>
-            </w:pPr>
-            <w:r>
-              <w:rPr>
-                <w:rFonts w:ascii="Times New Roman" w:hAnsi="Times New Roman"/>
-                <w:b w:val="0"/>
-                <w:sz w:val="26"/>
-              </w:rPr>
-              <w:t>1,5</w:t>
-            </w:r>
-          </w:p>
-        </w:tc>
-        <w:tc>
-          <w:tcPr>
-            <w:tcW w:type="dxa" w:w="6123"/>
-          </w:tcPr>
-          <w:p>
-            <w:pPr>
-              <w:keepNext/>
-              <w:spacing w:after="40" w:before="0" w:line="240" w:lineRule="auto"/>
-              <w:ind w:firstLine="0"/>
-              <w:jc w:val="left"/>
-            </w:pPr>
-            <w:r>
-              <w:rPr>
-                <w:rFonts w:ascii="Times New Roman" w:hAnsi="Times New Roman"/>
-                <w:b w:val="0"/>
-                <w:sz w:val="26"/>
-              </w:rPr>
-              <w:t>Tổng TOTAL/PASS/FAIL đúng; mã 0 khi tất cả đạt, 1 khi có tệp lỗi, 2 khi đầu vào không dùng được.</w:t>
+              <w:t>Lớp trả dữ liệu đúng kiểu; không in HTML, không phụ thuộc Session hoặc CSDL.</w:t>
             </w:r>
           </w:p>
         </w:tc>
@@ -5734,7 +4951,7 @@
     <w:p>
       <w:pPr/>
       <w:r>
-        <w:t>Bước 1. Lưu mã bài mẫu và bài tự làm tại Lab01/Ma_nguon, kèm dữ liệu, kiểm thử và README. Loại bỏ .local, mật khẩu và dữ liệu cá nhân thật khỏi bài nộp.</w:t>
+        <w:t>Bước 1. Lưu mã bài mẫu và bài tự làm tại Lab02/Ma_nguon, kèm dữ liệu, kiểm thử và README. Loại bỏ .local, mật khẩu và dữ liệu cá nhân thật khỏi bài nộp.</w:t>
       </w:r>
     </w:p>
     <w:p>
@@ -5746,14 +4963,14 @@
     <w:p>
       <w:pPr/>
       <w:r>
-        <w:t>Bước 3. Commit, đẩy mã lên GitHub và nộp tên nhóm/thành viên, Lab 01, liên kết Ma_nguon tại đúng commit. Kiểm tra quyền đọc; kèm lần chạy Actions khi được yêu cầu. Hạn và địa chỉ nộp do giảng viên công bố. Nếu nhận ZIP, giữ nguyên cấu trúc trên.</w:t>
+        <w:t>Bước 3. Commit, đẩy mã lên GitHub và nộp tên nhóm/thành viên, Lab 02, liên kết Ma_nguon tại đúng commit. Kiểm tra quyền đọc; kèm lần chạy Actions khi được yêu cầu. Hạn và địa chỉ nộp do giảng viên công bố. Nếu nhận ZIP, giữ nguyên cấu trúc trên.</w:t>
       </w:r>
     </w:p>
     <w:sectPr>
       <w:headerReference w:type="default" r:id="rId9"/>
-      <w:headerReference w:type="first" r:id="rId12"/>
-      <w:footerReference w:type="default" r:id="rId13"/>
-      <w:footerReference w:type="first" r:id="rId14"/>
+      <w:headerReference w:type="first" r:id="rId11"/>
+      <w:footerReference w:type="default" r:id="rId12"/>
+      <w:footerReference w:type="first" r:id="rId13"/>
       <w:pgSz w:w="11906" w:h="16838"/>
       <w:pgMar w:top="1134" w:right="1134" w:bottom="1134" w:left="1701" w:header="369" w:footer="567" w:gutter="0"/>
       <w:cols w:space="720"/>

</xml_diff>